<commit_message>
Trim report prose to sit within the brief's word count
Tighten verbose/duplicative prose (executive summary, exploitation PoCs,
business impact, remediation, phased strategy) so body prose is ~3,550 words,
within the brief's 3,500-5,000 range; no required content removed.

Co-Authored-By: Claude Opus 4.8 <noreply@anthropic.com>
Claude-Session: https://claude.ai/code/session_01T2u7k6oDPh41eeMonoUXLu
</commit_message>
<xml_diff>
--- a/SecureBank_PenTest_Report_FINAL.docx
+++ b/SecureBank_PenTest_Report_FINAL.docx
@@ -3125,7 +3125,7 @@
           <w:sz w:val="22"/>
           <w:szCs w:val="22"/>
         </w:rPr>
-        <w:t xml:space="preserve">In line with professional practice and the brief, automated tools were used only to assist discovery; every finding was interpreted and validated manually, and conclusions were drawn from reproducible evidence rather than from scanner output alone. The main tools were nmap (service discovery), nikto (web-server checks), Burp Suite (interception, manual testing with Repeater, and brute-force testing with Intruder), curl (raw HTTP requests), sqlmap (SQL-injection testing), the browser developer tools (traffic, cookies and the console), and standard command-line utilities for analysing the JavaScript bundle. Each tool was chosen to fit a specific phase of the methodology.</w:t>
+        <w:t xml:space="preserve">Automated tools were used only to assist discovery; every finding was interpreted and validated manually, and conclusions were drawn from reproducible evidence rather than scanner output alone. The main tools were nmap, nikto, Burp Suite (Repeater and Intruder), curl, sqlmap and the browser developer tools; each was chosen to fit a specific phase (see Appendix B).</w:t>
       </w:r>
     </w:p>
     <w:p>
@@ -4689,7 +4689,7 @@
           <w:sz w:val="22"/>
           <w:szCs w:val="22"/>
         </w:rPr>
-        <w:t xml:space="preserve">Some controls are implemented correctly — for example, session cookies are marked HttpOnly and SameSite=Lax — but the authenticated application layer contains systemic authorisation flaws. A low-privilege customer account can reach data that should be restricted to staff, and individual accounts can be taken over through unthrottled password guessing. Until authorisation is enforced on the server, the application is not fit to hold real customer financial data.</w:t>
+        <w:t xml:space="preserve">Some controls are implemented correctly (for example, HttpOnly, SameSite=Lax session cookies), but the authenticated application layer contains systemic authorisation flaws: a low-privilege customer account can reach staff-only data, and accounts can be taken over through unthrottled password guessing. Until authorisation is enforced on the server, the application is not fit to hold real customer financial data.</w:t>
       </w:r>
     </w:p>
     <w:p>
@@ -5278,33 +5278,8 @@
     </w:tbl>
     <w:p>
       <w:pPr>
-        <w:spacing w:after="60"/>
-      </w:pPr>
-    </w:p>
-    <w:p>
-      <w:pPr>
-        <w:spacing w:after="140" w:line="276"/>
-      </w:pPr>
-      <w:r>
-        <w:rPr>
-          <w:b/>
-          <w:bCs/>
-          <w:color w:val="5A6B80"/>
-          <w:sz w:val="20"/>
-          <w:szCs w:val="20"/>
-        </w:rPr>
-        <w:t xml:space="preserve">Note on scoring: </w:t>
-      </w:r>
-      <w:r>
-        <w:rPr>
-          <w:i/>
-          <w:iCs/>
-          <w:color w:val="5A6B80"/>
-          <w:sz w:val="20"/>
-          <w:szCs w:val="20"/>
-        </w:rPr>
-        <w:t xml:space="preserve">the CVSS v3.1 base scores classify four findings as Medium because they require a low-privilege account and affect confidentiality only. For a bank, the business impact of VUL-001 and VUL-002 — disclosure of every customer’s financial data — is nonetheless assessed as High. Section B8 explains this difference.</w:t>
-      </w:r>
+        <w:spacing w:after="100"/>
+      </w:pPr>
     </w:p>
     <w:p>
       <w:pPr>
@@ -11561,7 +11536,7 @@
           <w:sz w:val="22"/>
           <w:szCs w:val="22"/>
         </w:rPr>
-        <w:t xml:space="preserve">to retrieve all customers’ account data using only an ordinary customer session. Logged in as a standard customer, the author issued GET /api/operations in Burp Repeater. The response (Figure 8) returned HTTP 200 and a complete list of customer accounts and balances belonging to many different customers. The same data was retrieved using curl with the session cookie (Figure 9), confirming the finding is reproducible outside the browser. No administrative privilege, and no interaction from any other user, was required.</w:t>
+        <w:t xml:space="preserve">retrieve all customers’ account data from an ordinary customer session. In Burp Repeater, GET /api/operations returned HTTP 200 with a complete list of customers’ accounts and balances (Figure 8); the same data was reproduced with curl and the session cookie (Figure 9). No administrative privilege or interaction from another user was required.</w:t>
       </w:r>
     </w:p>
     <w:p>
@@ -11590,7 +11565,7 @@
           <w:sz w:val="22"/>
           <w:szCs w:val="22"/>
         </w:rPr>
-        <w:t xml:space="preserve">to read an account belonging to another customer. Using Burp Repeater and a valid customer session, the author requested /api/accounts/2 and /api/accounts/3 (Figures 10 and 11). Each returned HTTP 200 with the account’s number, type and balance, and the user_id field showed the records belonged to different customers. By changing a single number in the URL, the author moved from their own data to another customer’s data, with no additional privilege.</w:t>
+        <w:t xml:space="preserve">read an account belonging to another customer. From a valid customer session, requesting /api/accounts/2 and /api/accounts/3 in Burp Repeater (Figures 10 and 11) each returned HTTP 200 with the account’s number, type and balance; the user_id field showed the records belonged to different customers. Changing a single number in the URL moved from the author’s own data to another customer’s, with no additional privilege.</w:t>
       </w:r>
     </w:p>
     <w:p>
@@ -11619,7 +11594,7 @@
           <w:sz w:val="22"/>
           <w:szCs w:val="22"/>
         </w:rPr>
-        <w:t xml:space="preserve">to recover a customer’s password by brute force. The author configured a Burp Intruder Sniper attack with the password field as the payload position and a list of sixteen candidate passwords (Figure 12). All fifteen incorrect guesses returned 401 with the same response length, while the sixteenth, Welcome123!, returned 200 with a different length (Figure 13), clearly identifying the valid credential. The attack completed without any rate limiting, lockout or challenge.</w:t>
+        <w:t xml:space="preserve">recover a customer’s password by brute force. A Burp Intruder Sniper attack on the password field with sixteen candidate passwords (Figure 12) returned 401 with the same length for all fifteen wrong guesses, while Welcome123! returned 200 with a different length (Figure 13), identifying the valid credential. The attack completed with no rate limiting, lockout or challenge.</w:t>
       </w:r>
     </w:p>
     <w:p>
@@ -11648,7 +11623,7 @@
           <w:sz w:val="22"/>
           <w:szCs w:val="22"/>
         </w:rPr>
-        <w:t xml:space="preserve">to store script that executes when the message is viewed. The author submitted support messages containing an image/onerror payload and a script-tag alert payload (Figures 14 and 15). On viewing the conversation, the injected JavaScript executed, logging to the console and raising an alert, and a separate italic-tag payload rendered as formatted HTML (Figure 16). This confirms that attacker-controlled script is stored and executed in the viewer’s browser, which in a staff context could be used to hijack a session or act as that user.</w:t>
+        <w:t xml:space="preserve">store script that executes when the message is viewed. Support messages containing an image/onerror payload and a script-tag alert payload (Figures 14 and 15) executed on viewing the conversation — logging to the console and raising an alert — and a separate italic-tag payload rendered as formatted HTML (Figure 16). This confirms attacker-controlled script is stored and executed in the viewer’s browser, which in a staff context could hijack a session or act as that user.</w:t>
       </w:r>
     </w:p>
     <w:p>
@@ -11755,7 +11730,7 @@
           <w:sz w:val="22"/>
           <w:szCs w:val="22"/>
         </w:rPr>
-        <w:t xml:space="preserve">It is important to state what was not demonstrated. The author did not obtain an administrative account, nor escalate to the underlying server or database; testing remained within the application. This is because the application does not rely on a separate admin role to protect the operations data: the data is simply exposed to any authenticated user, so no escalation was required to reach it. Where a true staff role would be needed (for example, to act within the operations interface itself), the realistic route would be the stored-XSS path against a staff viewer rather than a direct escalation. No post-exploitation evidence was fabricated, and the trust boundary crossed is the application’s own authorisation layer.</w:t>
+        <w:t xml:space="preserve">To be clear about what was not demonstrated: the author did not obtain an administrative account or escalate to the server or database; testing remained within the application. No escalation was needed to reach the operations data, because it is simply exposed to any authenticated user. Where a true staff role would be required, the realistic route is the stored-XSS path against a staff viewer rather than a direct escalation. No post-exploitation evidence was fabricated; the trust boundary crossed is the application’s own authorisation layer.</w:t>
       </w:r>
     </w:p>
     <w:p>
@@ -13203,7 +13178,7 @@
           <w:sz w:val="22"/>
           <w:szCs w:val="22"/>
         </w:rPr>
-        <w:t xml:space="preserve">For SecureBank Ltd, the confirmed weaknesses translate into concrete business consequences. The broken access control and IDOR findings (VUL-001, VUL-002) allow the confidentiality of every customer’s financial data to be breached using a single customer account; for a bank this is among the most damaging outcomes possible, exposing names, account numbers and balances. The authentication weakness (VUL-003) allows individual accounts to be taken over through password guessing, opening the door to unauthorised access and, potentially, fraudulent transactions. The stored XSS finding (VUL-004) puts support staff at risk and could be used to compromise more privileged accounts. The configuration weaknesses (VUL-005), including unencrypted HTTP, increase the likelihood that credentials and data are intercepted and weaken the application’s overall resilience.</w:t>
+        <w:t xml:space="preserve">For SecureBank Ltd, the confirmed weaknesses carry concrete business consequences. The broken access control and IDOR findings (VUL-001, VUL-002) breach the confidentiality of every customer’s financial data from a single customer account — among the most damaging outcomes possible for a bank. The authentication weakness (VUL-003) allows account takeover through password guessing, opening the door to fraud. Stored XSS (VUL-004) puts support staff at risk and could compromise more privileged accounts, and the configuration weaknesses (VUL-005), including unencrypted HTTP, make interception more likely and weaken overall resilience.</w:t>
       </w:r>
     </w:p>
     <w:p>
@@ -13215,7 +13190,7 @@
           <w:sz w:val="22"/>
           <w:szCs w:val="22"/>
         </w:rPr>
-        <w:t xml:space="preserve">Beyond the direct technical impact, these issues carry regulatory and reputational consequences. Unauthorised disclosure of customers’ personal and financial data would breach the UK GDPR and the Data Protection Act 2018, potentially attracting regulatory action, and would seriously damage customer trust in a bank whose core promise is to keep money and information safe. The likelihood of exploitation is high, because the weaknesses require only an ordinary account and widely available tools.</w:t>
+        <w:t xml:space="preserve">Beyond the technical impact, unauthorised disclosure of personal and financial data would breach the UK GDPR and the Data Protection Act 2018 — risking regulatory action and serious damage to customer trust. The likelihood of exploitation is high, as the weaknesses require only an ordinary account and widely available tools.</w:t>
       </w:r>
     </w:p>
     <w:p>
@@ -13235,19 +13210,7 @@
           <w:sz w:val="22"/>
           <w:szCs w:val="22"/>
         </w:rPr>
-        <w:t xml:space="preserve">The following remediations address the root cause of each finding rather than its symptoms; priorities are shown in the table. The single most important change is to enforce authorisation on the server for every request: for each API call the server must check that the authenticated user is permitted to use the specific function and to access the specific object requested, and must deny by default. Hiding features in the front-end must never be relied upon as a control.</w:t>
-      </w:r>
-    </w:p>
-    <w:p>
-      <w:pPr>
-        <w:spacing w:after="140" w:line="276"/>
-      </w:pPr>
-      <w:r>
-        <w:rPr>
-          <w:sz w:val="22"/>
-          <w:szCs w:val="22"/>
-        </w:rPr>
-        <w:t xml:space="preserve">For the login, anti-automation controls (rate limiting, temporary lockout or back-off, and a challenge after repeated failures) should be added, together with a strong password policy, the removal of default passwords, and ideally multi-factor authentication. User-supplied content such as support messages must be contextually output-encoded when displayed, with a Content-Security-Policy as defence-in-depth. The server configuration should be corrected by suppressing the version header, adding the missing security headers, updating nginx and, critically, serving the application only over HTTPS/TLS. After remediation, each finding should be retested to confirm the fix, and access-control tests should be added to the development pipeline to prevent regressions.</w:t>
+        <w:t xml:space="preserve">The following remediations address the root cause of each finding rather than its symptoms. The single most important change is to enforce authorisation on the server for every request — checking that the authenticated user may use the function and access the object requested, and denying by default; hiding features in the front-end must never be relied upon as a control. The per-finding fixes are summarised below, followed by a prioritised roadmap and a phased plan. After remediation, each finding should be retested and access-control tests added to the development pipeline to prevent regressions.</w:t>
       </w:r>
     </w:p>
     <w:tbl>
@@ -14956,7 +14919,12 @@
     </w:p>
     <w:p>
       <w:pPr>
-        <w:spacing w:after="140" w:line="276"/>
+        <w:pStyle w:val="ListParagraph"/>
+        <w:numPr>
+          <w:ilvl w:val="0"/>
+          <w:numId w:val="2"/>
+        </w:numPr>
+        <w:spacing w:after="60" w:line="264"/>
       </w:pPr>
       <w:r>
         <w:rPr>
@@ -14965,19 +14933,24 @@
           <w:sz w:val="22"/>
           <w:szCs w:val="22"/>
         </w:rPr>
-        <w:t xml:space="preserve">Phase 1 — Immediate (days). </w:t>
+        <w:t xml:space="preserve">Phase 1 — Immediate: </w:t>
       </w:r>
       <w:r>
         <w:rPr>
           <w:sz w:val="22"/>
           <w:szCs w:val="22"/>
         </w:rPr>
-        <w:t xml:space="preserve">Enforce server-side authorisation on /api/operations and on /api/accounts/{id} so that non-staff and non-owners are refused (HTTP 403), and add rate limiting / temporary lockout to the login. These three changes remove the two highest-impact attack paths (mass data disclosure and account takeover).</w:t>
-      </w:r>
-    </w:p>
-    <w:p>
-      <w:pPr>
-        <w:spacing w:after="140" w:line="276"/>
+        <w:t xml:space="preserve">enforce server-side authorisation on /api/operations and /api/accounts/{id}, and add rate limiting / lockout to the login — closing the two highest-impact paths (mass data disclosure, account takeover).</w:t>
+      </w:r>
+    </w:p>
+    <w:p>
+      <w:pPr>
+        <w:pStyle w:val="ListParagraph"/>
+        <w:numPr>
+          <w:ilvl w:val="0"/>
+          <w:numId w:val="2"/>
+        </w:numPr>
+        <w:spacing w:after="60" w:line="264"/>
       </w:pPr>
       <w:r>
         <w:rPr>
@@ -14986,19 +14959,24 @@
           <w:sz w:val="22"/>
           <w:szCs w:val="22"/>
         </w:rPr>
-        <w:t xml:space="preserve">Phase 2 — Short term (1–2 weeks). </w:t>
+        <w:t xml:space="preserve">Phase 2 — Short term: </w:t>
       </w:r>
       <w:r>
         <w:rPr>
           <w:sz w:val="22"/>
           <w:szCs w:val="22"/>
         </w:rPr>
-        <w:t xml:space="preserve">Apply contextual output encoding and a Content-Security-Policy to the support feature to close the stored-XSS path; enforce a strong password policy, remove default passwords, and begin rolling out multi-factor authentication; add automated access-control tests to the build pipeline.</w:t>
-      </w:r>
-    </w:p>
-    <w:p>
-      <w:pPr>
-        <w:spacing w:after="140" w:line="276"/>
+        <w:t xml:space="preserve">output-encode support content with a CSP; enforce a strong password policy, remove default passwords, roll out MFA; add access-control tests to the pipeline.</w:t>
+      </w:r>
+    </w:p>
+    <w:p>
+      <w:pPr>
+        <w:pStyle w:val="ListParagraph"/>
+        <w:numPr>
+          <w:ilvl w:val="0"/>
+          <w:numId w:val="2"/>
+        </w:numPr>
+        <w:spacing w:after="60" w:line="264"/>
       </w:pPr>
       <w:r>
         <w:rPr>
@@ -15007,14 +14985,14 @@
           <w:sz w:val="22"/>
           <w:szCs w:val="22"/>
         </w:rPr>
-        <w:t xml:space="preserve">Phase 3 — Longer term (30–90 days). </w:t>
+        <w:t xml:space="preserve">Phase 3 — Longer term: </w:t>
       </w:r>
       <w:r>
         <w:rPr>
           <w:sz w:val="22"/>
           <w:szCs w:val="22"/>
         </w:rPr>
-        <w:t xml:space="preserve">Correct the server configuration (suppress version banners, add the missing security headers, update nginx, serve only over HTTPS/TLS); standardise a single server-side authorisation layer across all endpoints; and retest every finding, with periodic reassessment after major releases.</w:t>
+        <w:t xml:space="preserve">harden the server (headers, nginx update, HTTPS/TLS); standardise one server-side authorisation layer; retest all findings and reassess after major releases.</w:t>
       </w:r>
     </w:p>
     <w:p>

</xml_diff>

<commit_message>
Set remediation roadmap to within 3 days; add CWE to overview tables
- All roadmap targets set to within 3 days; phased plan rewritten as a Day 1-3 plan
- Add CWE column to the findings summary, risk-assessment and remediation tables
  (per-finding grids already carried CWE)
- Body prose held at ~3,545 words, within the brief's 3,500-5,000 range

Co-Authored-By: Claude Opus 4.8 <noreply@anthropic.com>
Claude-Session: https://claude.ai/code/session_01T2u7k6oDPh41eeMonoUXLu
</commit_message>
<xml_diff>
--- a/SecureBank_PenTest_Report_FINAL.docx
+++ b/SecureBank_PenTest_Report_FINAL.docx
@@ -6974,11 +6974,12 @@
         </w:tblBorders>
       </w:tblPr>
       <w:tblGrid>
-        <w:gridCol w:w="1050"/>
-        <w:gridCol w:w="3200"/>
-        <w:gridCol w:w="2550"/>
-        <w:gridCol w:w="1260"/>
-        <w:gridCol w:w="1300"/>
+        <w:gridCol w:w="900"/>
+        <w:gridCol w:w="2650"/>
+        <w:gridCol w:w="2050"/>
+        <w:gridCol w:w="1400"/>
+        <w:gridCol w:w="1160"/>
+        <w:gridCol w:w="1200"/>
       </w:tblGrid>
       <w:tr>
         <w:trPr>
@@ -6986,7 +6987,7 @@
         </w:trPr>
         <w:tc>
           <w:tcPr>
-            <w:tcW w:type="dxa" w:w="1050"/>
+            <w:tcW w:type="dxa" w:w="900"/>
             <w:shd w:fill="1F3A5F" w:color="auto" w:val="clear"/>
             <w:tcMar>
               <w:top w:type="dxa" w:w="70"/>
@@ -7015,7 +7016,7 @@
         </w:tc>
         <w:tc>
           <w:tcPr>
-            <w:tcW w:type="dxa" w:w="3200"/>
+            <w:tcW w:type="dxa" w:w="2650"/>
             <w:shd w:fill="1F3A5F" w:color="auto" w:val="clear"/>
             <w:tcMar>
               <w:top w:type="dxa" w:w="70"/>
@@ -7044,7 +7045,7 @@
         </w:tc>
         <w:tc>
           <w:tcPr>
-            <w:tcW w:type="dxa" w:w="2550"/>
+            <w:tcW w:type="dxa" w:w="2050"/>
             <w:shd w:fill="1F3A5F" w:color="auto" w:val="clear"/>
             <w:tcMar>
               <w:top w:type="dxa" w:w="70"/>
@@ -7073,7 +7074,7 @@
         </w:tc>
         <w:tc>
           <w:tcPr>
-            <w:tcW w:type="dxa" w:w="1260"/>
+            <w:tcW w:type="dxa" w:w="1400"/>
             <w:shd w:fill="1F3A5F" w:color="auto" w:val="clear"/>
             <w:tcMar>
               <w:top w:type="dxa" w:w="70"/>
@@ -7096,13 +7097,13 @@
                 <w:sz w:val="20"/>
                 <w:szCs w:val="20"/>
               </w:rPr>
-              <w:t xml:space="preserve">Severity</w:t>
-            </w:r>
-          </w:p>
-        </w:tc>
-        <w:tc>
-          <w:tcPr>
-            <w:tcW w:type="dxa" w:w="1300"/>
+              <w:t xml:space="preserve">CWE</w:t>
+            </w:r>
+          </w:p>
+        </w:tc>
+        <w:tc>
+          <w:tcPr>
+            <w:tcW w:type="dxa" w:w="1160"/>
             <w:shd w:fill="1F3A5F" w:color="auto" w:val="clear"/>
             <w:tcMar>
               <w:top w:type="dxa" w:w="70"/>
@@ -7125,103 +7126,26 @@
                 <w:sz w:val="20"/>
                 <w:szCs w:val="20"/>
               </w:rPr>
-              <w:t xml:space="preserve">Status</w:t>
-            </w:r>
-          </w:p>
-        </w:tc>
-      </w:tr>
-      <w:tr>
-        <w:tc>
-          <w:tcPr>
-            <w:tcW w:type="dxa" w:w="1050"/>
-            <w:tcMar>
-              <w:top w:type="dxa" w:w="70"/>
-              <w:left w:type="dxa" w:w="110"/>
-              <w:bottom w:type="dxa" w:w="70"/>
-              <w:right w:type="dxa" w:w="110"/>
-            </w:tcMar>
-            <w:vAlign w:val="center"/>
-          </w:tcPr>
-          <w:p>
-            <w:pPr>
-              <w:spacing w:after="0" w:line="252"/>
-              <w:jc w:val="left"/>
-            </w:pPr>
-            <w:r>
-              <w:rPr>
-                <w:sz w:val="20"/>
-                <w:szCs w:val="20"/>
-              </w:rPr>
-              <w:t xml:space="preserve">VUL-001</w:t>
-            </w:r>
-          </w:p>
-        </w:tc>
-        <w:tc>
-          <w:tcPr>
-            <w:tcW w:type="dxa" w:w="3200"/>
-            <w:tcMar>
-              <w:top w:type="dxa" w:w="70"/>
-              <w:left w:type="dxa" w:w="110"/>
-              <w:bottom w:type="dxa" w:w="70"/>
-              <w:right w:type="dxa" w:w="110"/>
-            </w:tcMar>
-            <w:vAlign w:val="center"/>
-          </w:tcPr>
-          <w:p>
-            <w:pPr>
-              <w:spacing w:after="0" w:line="252"/>
-              <w:jc w:val="left"/>
-            </w:pPr>
-            <w:r>
-              <w:rPr>
-                <w:sz w:val="20"/>
-                <w:szCs w:val="20"/>
-              </w:rPr>
-              <w:t xml:space="preserve">Broken function-level access control (/api/operations)</w:t>
-            </w:r>
-          </w:p>
-        </w:tc>
-        <w:tc>
-          <w:tcPr>
-            <w:tcW w:type="dxa" w:w="2550"/>
-            <w:tcMar>
-              <w:top w:type="dxa" w:w="70"/>
-              <w:left w:type="dxa" w:w="110"/>
-              <w:bottom w:type="dxa" w:w="70"/>
-              <w:right w:type="dxa" w:w="110"/>
-            </w:tcMar>
-            <w:vAlign w:val="center"/>
-          </w:tcPr>
-          <w:p>
-            <w:pPr>
-              <w:spacing w:after="0" w:line="252"/>
-              <w:jc w:val="left"/>
-            </w:pPr>
-            <w:r>
-              <w:rPr>
-                <w:sz w:val="20"/>
-                <w:szCs w:val="20"/>
-              </w:rPr>
-              <w:t xml:space="preserve">A01:2021 Broken Access Control</w:t>
-            </w:r>
-          </w:p>
-        </w:tc>
-        <w:tc>
-          <w:tcPr>
-            <w:tcW w:type="dxa" w:w="1260"/>
-            <w:shd w:fill="B9770E" w:color="auto" w:val="clear"/>
-            <w:tcMar>
-              <w:top w:type="dxa" w:w="70"/>
-              <w:left w:type="dxa" w:w="110"/>
-              <w:bottom w:type="dxa" w:w="70"/>
-              <w:right w:type="dxa" w:w="110"/>
-            </w:tcMar>
-            <w:vAlign w:val="center"/>
-          </w:tcPr>
-          <w:p>
-            <w:pPr>
-              <w:spacing w:after="0" w:line="252"/>
-              <w:jc w:val="center"/>
+              <w:t xml:space="preserve">Severity</w:t>
+            </w:r>
+          </w:p>
+        </w:tc>
+        <w:tc>
+          <w:tcPr>
+            <w:tcW w:type="dxa" w:w="1200"/>
+            <w:shd w:fill="1F3A5F" w:color="auto" w:val="clear"/>
+            <w:tcMar>
+              <w:top w:type="dxa" w:w="70"/>
+              <w:left w:type="dxa" w:w="110"/>
+              <w:bottom w:type="dxa" w:w="70"/>
+              <w:right w:type="dxa" w:w="110"/>
+            </w:tcMar>
+            <w:vAlign w:val="center"/>
+          </w:tcPr>
+          <w:p>
+            <w:pPr>
+              <w:spacing w:after="0" w:line="252"/>
+              <w:jc w:val="left"/>
             </w:pPr>
             <w:r>
               <w:rPr>
@@ -7231,13 +7155,144 @@
                 <w:sz w:val="20"/>
                 <w:szCs w:val="20"/>
               </w:rPr>
+              <w:t xml:space="preserve">Status</w:t>
+            </w:r>
+          </w:p>
+        </w:tc>
+      </w:tr>
+      <w:tr>
+        <w:tc>
+          <w:tcPr>
+            <w:tcW w:type="dxa" w:w="900"/>
+            <w:tcMar>
+              <w:top w:type="dxa" w:w="70"/>
+              <w:left w:type="dxa" w:w="110"/>
+              <w:bottom w:type="dxa" w:w="70"/>
+              <w:right w:type="dxa" w:w="110"/>
+            </w:tcMar>
+            <w:vAlign w:val="center"/>
+          </w:tcPr>
+          <w:p>
+            <w:pPr>
+              <w:spacing w:after="0" w:line="252"/>
+              <w:jc w:val="left"/>
+            </w:pPr>
+            <w:r>
+              <w:rPr>
+                <w:sz w:val="20"/>
+                <w:szCs w:val="20"/>
+              </w:rPr>
+              <w:t xml:space="preserve">VUL-001</w:t>
+            </w:r>
+          </w:p>
+        </w:tc>
+        <w:tc>
+          <w:tcPr>
+            <w:tcW w:type="dxa" w:w="2650"/>
+            <w:tcMar>
+              <w:top w:type="dxa" w:w="70"/>
+              <w:left w:type="dxa" w:w="110"/>
+              <w:bottom w:type="dxa" w:w="70"/>
+              <w:right w:type="dxa" w:w="110"/>
+            </w:tcMar>
+            <w:vAlign w:val="center"/>
+          </w:tcPr>
+          <w:p>
+            <w:pPr>
+              <w:spacing w:after="0" w:line="252"/>
+              <w:jc w:val="left"/>
+            </w:pPr>
+            <w:r>
+              <w:rPr>
+                <w:sz w:val="20"/>
+                <w:szCs w:val="20"/>
+              </w:rPr>
+              <w:t xml:space="preserve">Broken function-level access control (/api/operations)</w:t>
+            </w:r>
+          </w:p>
+        </w:tc>
+        <w:tc>
+          <w:tcPr>
+            <w:tcW w:type="dxa" w:w="2050"/>
+            <w:tcMar>
+              <w:top w:type="dxa" w:w="70"/>
+              <w:left w:type="dxa" w:w="110"/>
+              <w:bottom w:type="dxa" w:w="70"/>
+              <w:right w:type="dxa" w:w="110"/>
+            </w:tcMar>
+            <w:vAlign w:val="center"/>
+          </w:tcPr>
+          <w:p>
+            <w:pPr>
+              <w:spacing w:after="0" w:line="252"/>
+              <w:jc w:val="left"/>
+            </w:pPr>
+            <w:r>
+              <w:rPr>
+                <w:sz w:val="20"/>
+                <w:szCs w:val="20"/>
+              </w:rPr>
+              <w:t xml:space="preserve">A01:2021 Broken Access Control</w:t>
+            </w:r>
+          </w:p>
+        </w:tc>
+        <w:tc>
+          <w:tcPr>
+            <w:tcW w:type="dxa" w:w="1400"/>
+            <w:tcMar>
+              <w:top w:type="dxa" w:w="70"/>
+              <w:left w:type="dxa" w:w="110"/>
+              <w:bottom w:type="dxa" w:w="70"/>
+              <w:right w:type="dxa" w:w="110"/>
+            </w:tcMar>
+            <w:vAlign w:val="center"/>
+          </w:tcPr>
+          <w:p>
+            <w:pPr>
+              <w:spacing w:after="0" w:line="252"/>
+              <w:jc w:val="left"/>
+            </w:pPr>
+            <w:r>
+              <w:rPr>
+                <w:sz w:val="18"/>
+                <w:szCs w:val="18"/>
+              </w:rPr>
+              <w:t xml:space="preserve">CWE-862</w:t>
+            </w:r>
+          </w:p>
+        </w:tc>
+        <w:tc>
+          <w:tcPr>
+            <w:tcW w:type="dxa" w:w="1160"/>
+            <w:shd w:fill="B9770E" w:color="auto" w:val="clear"/>
+            <w:tcMar>
+              <w:top w:type="dxa" w:w="70"/>
+              <w:left w:type="dxa" w:w="110"/>
+              <w:bottom w:type="dxa" w:w="70"/>
+              <w:right w:type="dxa" w:w="110"/>
+            </w:tcMar>
+            <w:vAlign w:val="center"/>
+          </w:tcPr>
+          <w:p>
+            <w:pPr>
+              <w:spacing w:after="0" w:line="252"/>
+              <w:jc w:val="center"/>
+            </w:pPr>
+            <w:r>
+              <w:rPr>
+                <w:b/>
+                <w:bCs/>
+                <w:color w:val="FFFFFF"/>
+                <w:sz w:val="20"/>
+                <w:szCs w:val="20"/>
+              </w:rPr>
               <w:t xml:space="preserve">Medium</w:t>
             </w:r>
           </w:p>
         </w:tc>
         <w:tc>
           <w:tcPr>
-            <w:tcW w:type="dxa" w:w="1300"/>
+            <w:tcW w:type="dxa" w:w="1200"/>
             <w:tcMar>
               <w:top w:type="dxa" w:w="70"/>
               <w:left w:type="dxa" w:w="110"/>
@@ -7267,7 +7322,7 @@
       <w:tr>
         <w:tc>
           <w:tcPr>
-            <w:tcW w:type="dxa" w:w="1050"/>
+            <w:tcW w:type="dxa" w:w="900"/>
             <w:shd w:fill="F2F6FB" w:color="auto" w:val="clear"/>
             <w:tcMar>
               <w:top w:type="dxa" w:w="70"/>
@@ -7293,7 +7348,7 @@
         </w:tc>
         <w:tc>
           <w:tcPr>
-            <w:tcW w:type="dxa" w:w="3200"/>
+            <w:tcW w:type="dxa" w:w="2650"/>
             <w:shd w:fill="F2F6FB" w:color="auto" w:val="clear"/>
             <w:tcMar>
               <w:top w:type="dxa" w:w="70"/>
@@ -7319,7 +7374,7 @@
         </w:tc>
         <w:tc>
           <w:tcPr>
-            <w:tcW w:type="dxa" w:w="2550"/>
+            <w:tcW w:type="dxa" w:w="2050"/>
             <w:shd w:fill="F2F6FB" w:color="auto" w:val="clear"/>
             <w:tcMar>
               <w:top w:type="dxa" w:w="70"/>
@@ -7345,7 +7400,32 @@
         </w:tc>
         <w:tc>
           <w:tcPr>
-            <w:tcW w:type="dxa" w:w="1260"/>
+            <w:tcW w:type="dxa" w:w="1400"/>
+            <w:tcMar>
+              <w:top w:type="dxa" w:w="70"/>
+              <w:left w:type="dxa" w:w="110"/>
+              <w:bottom w:type="dxa" w:w="70"/>
+              <w:right w:type="dxa" w:w="110"/>
+            </w:tcMar>
+            <w:vAlign w:val="center"/>
+          </w:tcPr>
+          <w:p>
+            <w:pPr>
+              <w:spacing w:after="0" w:line="252"/>
+              <w:jc w:val="left"/>
+            </w:pPr>
+            <w:r>
+              <w:rPr>
+                <w:sz w:val="18"/>
+                <w:szCs w:val="18"/>
+              </w:rPr>
+              <w:t xml:space="preserve">CWE-639</w:t>
+            </w:r>
+          </w:p>
+        </w:tc>
+        <w:tc>
+          <w:tcPr>
+            <w:tcW w:type="dxa" w:w="1160"/>
             <w:shd w:fill="B9770E" w:color="auto" w:val="clear"/>
             <w:tcMar>
               <w:top w:type="dxa" w:w="70"/>
@@ -7374,7 +7454,7 @@
         </w:tc>
         <w:tc>
           <w:tcPr>
-            <w:tcW w:type="dxa" w:w="1300"/>
+            <w:tcW w:type="dxa" w:w="1200"/>
             <w:tcMar>
               <w:top w:type="dxa" w:w="70"/>
               <w:left w:type="dxa" w:w="110"/>
@@ -7404,7 +7484,7 @@
       <w:tr>
         <w:tc>
           <w:tcPr>
-            <w:tcW w:type="dxa" w:w="1050"/>
+            <w:tcW w:type="dxa" w:w="900"/>
             <w:tcMar>
               <w:top w:type="dxa" w:w="70"/>
               <w:left w:type="dxa" w:w="110"/>
@@ -7429,7 +7509,7 @@
         </w:tc>
         <w:tc>
           <w:tcPr>
-            <w:tcW w:type="dxa" w:w="3200"/>
+            <w:tcW w:type="dxa" w:w="2650"/>
             <w:tcMar>
               <w:top w:type="dxa" w:w="70"/>
               <w:left w:type="dxa" w:w="110"/>
@@ -7454,7 +7534,7 @@
         </w:tc>
         <w:tc>
           <w:tcPr>
-            <w:tcW w:type="dxa" w:w="2550"/>
+            <w:tcW w:type="dxa" w:w="2050"/>
             <w:tcMar>
               <w:top w:type="dxa" w:w="70"/>
               <w:left w:type="dxa" w:w="110"/>
@@ -7479,7 +7559,32 @@
         </w:tc>
         <w:tc>
           <w:tcPr>
-            <w:tcW w:type="dxa" w:w="1260"/>
+            <w:tcW w:type="dxa" w:w="1400"/>
+            <w:tcMar>
+              <w:top w:type="dxa" w:w="70"/>
+              <w:left w:type="dxa" w:w="110"/>
+              <w:bottom w:type="dxa" w:w="70"/>
+              <w:right w:type="dxa" w:w="110"/>
+            </w:tcMar>
+            <w:vAlign w:val="center"/>
+          </w:tcPr>
+          <w:p>
+            <w:pPr>
+              <w:spacing w:after="0" w:line="252"/>
+              <w:jc w:val="left"/>
+            </w:pPr>
+            <w:r>
+              <w:rPr>
+                <w:sz w:val="18"/>
+                <w:szCs w:val="18"/>
+              </w:rPr>
+              <w:t xml:space="preserve">CWE-307</w:t>
+            </w:r>
+          </w:p>
+        </w:tc>
+        <w:tc>
+          <w:tcPr>
+            <w:tcW w:type="dxa" w:w="1160"/>
             <w:shd w:fill="C0392B" w:color="auto" w:val="clear"/>
             <w:tcMar>
               <w:top w:type="dxa" w:w="70"/>
@@ -7508,7 +7613,7 @@
         </w:tc>
         <w:tc>
           <w:tcPr>
-            <w:tcW w:type="dxa" w:w="1300"/>
+            <w:tcW w:type="dxa" w:w="1200"/>
             <w:tcMar>
               <w:top w:type="dxa" w:w="70"/>
               <w:left w:type="dxa" w:w="110"/>
@@ -7538,7 +7643,7 @@
       <w:tr>
         <w:tc>
           <w:tcPr>
-            <w:tcW w:type="dxa" w:w="1050"/>
+            <w:tcW w:type="dxa" w:w="900"/>
             <w:shd w:fill="F2F6FB" w:color="auto" w:val="clear"/>
             <w:tcMar>
               <w:top w:type="dxa" w:w="70"/>
@@ -7564,7 +7669,7 @@
         </w:tc>
         <w:tc>
           <w:tcPr>
-            <w:tcW w:type="dxa" w:w="3200"/>
+            <w:tcW w:type="dxa" w:w="2650"/>
             <w:shd w:fill="F2F6FB" w:color="auto" w:val="clear"/>
             <w:tcMar>
               <w:top w:type="dxa" w:w="70"/>
@@ -7590,7 +7695,7 @@
         </w:tc>
         <w:tc>
           <w:tcPr>
-            <w:tcW w:type="dxa" w:w="2550"/>
+            <w:tcW w:type="dxa" w:w="2050"/>
             <w:shd w:fill="F2F6FB" w:color="auto" w:val="clear"/>
             <w:tcMar>
               <w:top w:type="dxa" w:w="70"/>
@@ -7616,7 +7721,32 @@
         </w:tc>
         <w:tc>
           <w:tcPr>
-            <w:tcW w:type="dxa" w:w="1260"/>
+            <w:tcW w:type="dxa" w:w="1400"/>
+            <w:tcMar>
+              <w:top w:type="dxa" w:w="70"/>
+              <w:left w:type="dxa" w:w="110"/>
+              <w:bottom w:type="dxa" w:w="70"/>
+              <w:right w:type="dxa" w:w="110"/>
+            </w:tcMar>
+            <w:vAlign w:val="center"/>
+          </w:tcPr>
+          <w:p>
+            <w:pPr>
+              <w:spacing w:after="0" w:line="252"/>
+              <w:jc w:val="left"/>
+            </w:pPr>
+            <w:r>
+              <w:rPr>
+                <w:sz w:val="18"/>
+                <w:szCs w:val="18"/>
+              </w:rPr>
+              <w:t xml:space="preserve">CWE-79</w:t>
+            </w:r>
+          </w:p>
+        </w:tc>
+        <w:tc>
+          <w:tcPr>
+            <w:tcW w:type="dxa" w:w="1160"/>
             <w:shd w:fill="B9770E" w:color="auto" w:val="clear"/>
             <w:tcMar>
               <w:top w:type="dxa" w:w="70"/>
@@ -7645,7 +7775,7 @@
         </w:tc>
         <w:tc>
           <w:tcPr>
-            <w:tcW w:type="dxa" w:w="1300"/>
+            <w:tcW w:type="dxa" w:w="1200"/>
             <w:tcMar>
               <w:top w:type="dxa" w:w="70"/>
               <w:left w:type="dxa" w:w="110"/>
@@ -7675,7 +7805,7 @@
       <w:tr>
         <w:tc>
           <w:tcPr>
-            <w:tcW w:type="dxa" w:w="1050"/>
+            <w:tcW w:type="dxa" w:w="900"/>
             <w:tcMar>
               <w:top w:type="dxa" w:w="70"/>
               <w:left w:type="dxa" w:w="110"/>
@@ -7700,7 +7830,7 @@
         </w:tc>
         <w:tc>
           <w:tcPr>
-            <w:tcW w:type="dxa" w:w="3200"/>
+            <w:tcW w:type="dxa" w:w="2650"/>
             <w:tcMar>
               <w:top w:type="dxa" w:w="70"/>
               <w:left w:type="dxa" w:w="110"/>
@@ -7725,7 +7855,7 @@
         </w:tc>
         <w:tc>
           <w:tcPr>
-            <w:tcW w:type="dxa" w:w="2550"/>
+            <w:tcW w:type="dxa" w:w="2050"/>
             <w:tcMar>
               <w:top w:type="dxa" w:w="70"/>
               <w:left w:type="dxa" w:w="110"/>
@@ -7750,7 +7880,32 @@
         </w:tc>
         <w:tc>
           <w:tcPr>
-            <w:tcW w:type="dxa" w:w="1260"/>
+            <w:tcW w:type="dxa" w:w="1400"/>
+            <w:tcMar>
+              <w:top w:type="dxa" w:w="70"/>
+              <w:left w:type="dxa" w:w="110"/>
+              <w:bottom w:type="dxa" w:w="70"/>
+              <w:right w:type="dxa" w:w="110"/>
+            </w:tcMar>
+            <w:vAlign w:val="center"/>
+          </w:tcPr>
+          <w:p>
+            <w:pPr>
+              <w:spacing w:after="0" w:line="252"/>
+              <w:jc w:val="left"/>
+            </w:pPr>
+            <w:r>
+              <w:rPr>
+                <w:sz w:val="18"/>
+                <w:szCs w:val="18"/>
+              </w:rPr>
+              <w:t xml:space="preserve">CWE-16, 200, 693</w:t>
+            </w:r>
+          </w:p>
+        </w:tc>
+        <w:tc>
+          <w:tcPr>
+            <w:tcW w:type="dxa" w:w="1160"/>
             <w:shd w:fill="B9770E" w:color="auto" w:val="clear"/>
             <w:tcMar>
               <w:top w:type="dxa" w:w="70"/>
@@ -7779,7 +7934,7 @@
         </w:tc>
         <w:tc>
           <w:tcPr>
-            <w:tcW w:type="dxa" w:w="1300"/>
+            <w:tcW w:type="dxa" w:w="1200"/>
             <w:tcMar>
               <w:top w:type="dxa" w:w="70"/>
               <w:left w:type="dxa" w:w="110"/>
@@ -12300,11 +12455,12 @@
         </w:tblBorders>
       </w:tblPr>
       <w:tblGrid>
-        <w:gridCol w:w="1050"/>
-        <w:gridCol w:w="3150"/>
-        <w:gridCol w:w="850"/>
-        <w:gridCol w:w="1300"/>
-        <w:gridCol w:w="3010"/>
+        <w:gridCol w:w="900"/>
+        <w:gridCol w:w="1250"/>
+        <w:gridCol w:w="2700"/>
+        <w:gridCol w:w="720"/>
+        <w:gridCol w:w="1150"/>
+        <w:gridCol w:w="2640"/>
       </w:tblGrid>
       <w:tr>
         <w:trPr>
@@ -12312,7 +12468,7 @@
         </w:trPr>
         <w:tc>
           <w:tcPr>
-            <w:tcW w:type="dxa" w:w="1050"/>
+            <w:tcW w:type="dxa" w:w="900"/>
             <w:shd w:fill="1F3A5F" w:color="auto" w:val="clear"/>
             <w:tcMar>
               <w:top w:type="dxa" w:w="70"/>
@@ -12341,7 +12497,7 @@
         </w:tc>
         <w:tc>
           <w:tcPr>
-            <w:tcW w:type="dxa" w:w="3150"/>
+            <w:tcW w:type="dxa" w:w="1250"/>
             <w:shd w:fill="1F3A5F" w:color="auto" w:val="clear"/>
             <w:tcMar>
               <w:top w:type="dxa" w:w="70"/>
@@ -12364,13 +12520,13 @@
                 <w:sz w:val="20"/>
                 <w:szCs w:val="20"/>
               </w:rPr>
-              <w:t xml:space="preserve">CVSS v3.1 vector</w:t>
-            </w:r>
-          </w:p>
-        </w:tc>
-        <w:tc>
-          <w:tcPr>
-            <w:tcW w:type="dxa" w:w="850"/>
+              <w:t xml:space="preserve">CWE</w:t>
+            </w:r>
+          </w:p>
+        </w:tc>
+        <w:tc>
+          <w:tcPr>
+            <w:tcW w:type="dxa" w:w="2700"/>
             <w:shd w:fill="1F3A5F" w:color="auto" w:val="clear"/>
             <w:tcMar>
               <w:top w:type="dxa" w:w="70"/>
@@ -12393,13 +12549,13 @@
                 <w:sz w:val="20"/>
                 <w:szCs w:val="20"/>
               </w:rPr>
-              <w:t xml:space="preserve">Score</w:t>
-            </w:r>
-          </w:p>
-        </w:tc>
-        <w:tc>
-          <w:tcPr>
-            <w:tcW w:type="dxa" w:w="1300"/>
+              <w:t xml:space="preserve">CVSS v3.1 vector</w:t>
+            </w:r>
+          </w:p>
+        </w:tc>
+        <w:tc>
+          <w:tcPr>
+            <w:tcW w:type="dxa" w:w="720"/>
             <w:shd w:fill="1F3A5F" w:color="auto" w:val="clear"/>
             <w:tcMar>
               <w:top w:type="dxa" w:w="70"/>
@@ -12422,13 +12578,13 @@
                 <w:sz w:val="20"/>
                 <w:szCs w:val="20"/>
               </w:rPr>
-              <w:t xml:space="preserve">Severity</w:t>
-            </w:r>
-          </w:p>
-        </w:tc>
-        <w:tc>
-          <w:tcPr>
-            <w:tcW w:type="dxa" w:w="3010"/>
+              <w:t xml:space="preserve">Score</w:t>
+            </w:r>
+          </w:p>
+        </w:tc>
+        <w:tc>
+          <w:tcPr>
+            <w:tcW w:type="dxa" w:w="1150"/>
             <w:shd w:fill="1F3A5F" w:color="auto" w:val="clear"/>
             <w:tcMar>
               <w:top w:type="dxa" w:w="70"/>
@@ -12451,106 +12607,26 @@
                 <w:sz w:val="20"/>
                 <w:szCs w:val="20"/>
               </w:rPr>
-              <w:t xml:space="preserve">Reasoning</w:t>
-            </w:r>
-          </w:p>
-        </w:tc>
-      </w:tr>
-      <w:tr>
-        <w:tc>
-          <w:tcPr>
-            <w:tcW w:type="dxa" w:w="1050"/>
-            <w:tcMar>
-              <w:top w:type="dxa" w:w="70"/>
-              <w:left w:type="dxa" w:w="110"/>
-              <w:bottom w:type="dxa" w:w="70"/>
-              <w:right w:type="dxa" w:w="110"/>
-            </w:tcMar>
-            <w:vAlign w:val="center"/>
-          </w:tcPr>
-          <w:p>
-            <w:pPr>
-              <w:spacing w:after="0" w:line="252"/>
-              <w:jc w:val="left"/>
-            </w:pPr>
-            <w:r>
-              <w:rPr>
-                <w:sz w:val="20"/>
-                <w:szCs w:val="20"/>
-              </w:rPr>
-              <w:t xml:space="preserve">VUL-003</w:t>
-            </w:r>
-          </w:p>
-        </w:tc>
-        <w:tc>
-          <w:tcPr>
-            <w:tcW w:type="dxa" w:w="3150"/>
-            <w:tcMar>
-              <w:top w:type="dxa" w:w="70"/>
-              <w:left w:type="dxa" w:w="110"/>
-              <w:bottom w:type="dxa" w:w="70"/>
-              <w:right w:type="dxa" w:w="110"/>
-            </w:tcMar>
-            <w:vAlign w:val="center"/>
-          </w:tcPr>
-          <w:p>
-            <w:pPr>
-              <w:spacing w:after="0" w:line="252"/>
-              <w:jc w:val="left"/>
-            </w:pPr>
-            <w:r>
-              <w:rPr>
-                <w:rFonts w:ascii="Consolas" w:cs="Consolas" w:eastAsia="Consolas" w:hAnsi="Consolas"/>
-                <w:sz w:val="16"/>
-                <w:szCs w:val="16"/>
-              </w:rPr>
-              <w:t xml:space="preserve">AV:N/AC:H/PR:N/UI:N/S:U/C:H/I:H/A:N</w:t>
-            </w:r>
-          </w:p>
-        </w:tc>
-        <w:tc>
-          <w:tcPr>
-            <w:tcW w:type="dxa" w:w="850"/>
-            <w:tcMar>
-              <w:top w:type="dxa" w:w="70"/>
-              <w:left w:type="dxa" w:w="110"/>
-              <w:bottom w:type="dxa" w:w="70"/>
-              <w:right w:type="dxa" w:w="110"/>
-            </w:tcMar>
-            <w:vAlign w:val="center"/>
-          </w:tcPr>
-          <w:p>
-            <w:pPr>
-              <w:spacing w:after="0" w:line="252"/>
-              <w:jc w:val="center"/>
-            </w:pPr>
-            <w:r>
-              <w:rPr>
-                <w:b/>
-                <w:bCs/>
-                <w:sz w:val="20"/>
-                <w:szCs w:val="20"/>
-              </w:rPr>
-              <w:t xml:space="preserve">7.4</w:t>
-            </w:r>
-          </w:p>
-        </w:tc>
-        <w:tc>
-          <w:tcPr>
-            <w:tcW w:type="dxa" w:w="1300"/>
-            <w:shd w:fill="C0392B" w:color="auto" w:val="clear"/>
-            <w:tcMar>
-              <w:top w:type="dxa" w:w="70"/>
-              <w:left w:type="dxa" w:w="110"/>
-              <w:bottom w:type="dxa" w:w="70"/>
-              <w:right w:type="dxa" w:w="110"/>
-            </w:tcMar>
-            <w:vAlign w:val="center"/>
-          </w:tcPr>
-          <w:p>
-            <w:pPr>
-              <w:spacing w:after="0" w:line="252"/>
-              <w:jc w:val="center"/>
+              <w:t xml:space="preserve">Severity</w:t>
+            </w:r>
+          </w:p>
+        </w:tc>
+        <w:tc>
+          <w:tcPr>
+            <w:tcW w:type="dxa" w:w="2640"/>
+            <w:shd w:fill="1F3A5F" w:color="auto" w:val="clear"/>
+            <w:tcMar>
+              <w:top w:type="dxa" w:w="70"/>
+              <w:left w:type="dxa" w:w="110"/>
+              <w:bottom w:type="dxa" w:w="70"/>
+              <w:right w:type="dxa" w:w="110"/>
+            </w:tcMar>
+            <w:vAlign w:val="center"/>
+          </w:tcPr>
+          <w:p>
+            <w:pPr>
+              <w:spacing w:after="0" w:line="252"/>
+              <w:jc w:val="left"/>
             </w:pPr>
             <w:r>
               <w:rPr>
@@ -12560,66 +12636,65 @@
                 <w:sz w:val="20"/>
                 <w:szCs w:val="20"/>
               </w:rPr>
-              <w:t xml:space="preserve">High</w:t>
-            </w:r>
-          </w:p>
-        </w:tc>
-        <w:tc>
-          <w:tcPr>
-            <w:tcW w:type="dxa" w:w="3010"/>
-            <w:tcMar>
-              <w:top w:type="dxa" w:w="70"/>
-              <w:left w:type="dxa" w:w="110"/>
-              <w:bottom w:type="dxa" w:w="70"/>
-              <w:right w:type="dxa" w:w="110"/>
-            </w:tcMar>
-            <w:vAlign w:val="center"/>
-          </w:tcPr>
-          <w:p>
-            <w:pPr>
-              <w:spacing w:after="0" w:line="252"/>
-              <w:jc w:val="left"/>
-            </w:pPr>
-            <w:r>
-              <w:rPr>
-                <w:sz w:val="20"/>
-                <w:szCs w:val="20"/>
-              </w:rPr>
-              <w:t xml:space="preserve">Network, unauthenticated; depends on a guessable password (AC:H). Leads to full account takeover (C:H/I:H).</w:t>
-            </w:r>
-          </w:p>
-        </w:tc>
-      </w:tr>
-      <w:tr>
-        <w:tc>
-          <w:tcPr>
-            <w:tcW w:type="dxa" w:w="1050"/>
-            <w:shd w:fill="F2F6FB" w:color="auto" w:val="clear"/>
-            <w:tcMar>
-              <w:top w:type="dxa" w:w="70"/>
-              <w:left w:type="dxa" w:w="110"/>
-              <w:bottom w:type="dxa" w:w="70"/>
-              <w:right w:type="dxa" w:w="110"/>
-            </w:tcMar>
-            <w:vAlign w:val="center"/>
-          </w:tcPr>
-          <w:p>
-            <w:pPr>
-              <w:spacing w:after="0" w:line="252"/>
-              <w:jc w:val="left"/>
-            </w:pPr>
-            <w:r>
-              <w:rPr>
-                <w:sz w:val="20"/>
-                <w:szCs w:val="20"/>
-              </w:rPr>
-              <w:t xml:space="preserve">VUL-001</w:t>
-            </w:r>
-          </w:p>
-        </w:tc>
-        <w:tc>
-          <w:tcPr>
-            <w:tcW w:type="dxa" w:w="3150"/>
+              <w:t xml:space="preserve">Reasoning</w:t>
+            </w:r>
+          </w:p>
+        </w:tc>
+      </w:tr>
+      <w:tr>
+        <w:tc>
+          <w:tcPr>
+            <w:tcW w:type="dxa" w:w="900"/>
+            <w:tcMar>
+              <w:top w:type="dxa" w:w="70"/>
+              <w:left w:type="dxa" w:w="110"/>
+              <w:bottom w:type="dxa" w:w="70"/>
+              <w:right w:type="dxa" w:w="110"/>
+            </w:tcMar>
+            <w:vAlign w:val="center"/>
+          </w:tcPr>
+          <w:p>
+            <w:pPr>
+              <w:spacing w:after="0" w:line="252"/>
+              <w:jc w:val="left"/>
+            </w:pPr>
+            <w:r>
+              <w:rPr>
+                <w:sz w:val="20"/>
+                <w:szCs w:val="20"/>
+              </w:rPr>
+              <w:t xml:space="preserve">VUL-003</w:t>
+            </w:r>
+          </w:p>
+        </w:tc>
+        <w:tc>
+          <w:tcPr>
+            <w:tcW w:type="dxa" w:w="1250"/>
+            <w:tcMar>
+              <w:top w:type="dxa" w:w="70"/>
+              <w:left w:type="dxa" w:w="110"/>
+              <w:bottom w:type="dxa" w:w="70"/>
+              <w:right w:type="dxa" w:w="110"/>
+            </w:tcMar>
+            <w:vAlign w:val="center"/>
+          </w:tcPr>
+          <w:p>
+            <w:pPr>
+              <w:spacing w:after="0" w:line="252"/>
+              <w:jc w:val="left"/>
+            </w:pPr>
+            <w:r>
+              <w:rPr>
+                <w:sz w:val="17"/>
+                <w:szCs w:val="17"/>
+              </w:rPr>
+              <w:t xml:space="preserve">CWE-307</w:t>
+            </w:r>
+          </w:p>
+        </w:tc>
+        <w:tc>
+          <w:tcPr>
+            <w:tcW w:type="dxa" w:w="2700"/>
             <w:tcMar>
               <w:top w:type="dxa" w:w="70"/>
               <w:left w:type="dxa" w:w="110"/>
@@ -12636,16 +12711,16 @@
             <w:r>
               <w:rPr>
                 <w:rFonts w:ascii="Consolas" w:cs="Consolas" w:eastAsia="Consolas" w:hAnsi="Consolas"/>
-                <w:sz w:val="16"/>
-                <w:szCs w:val="16"/>
-              </w:rPr>
-              <w:t xml:space="preserve">AV:N/AC:L/PR:L/UI:N/S:U/C:H/I:N/A:N</w:t>
-            </w:r>
-          </w:p>
-        </w:tc>
-        <w:tc>
-          <w:tcPr>
-            <w:tcW w:type="dxa" w:w="850"/>
+                <w:sz w:val="15"/>
+                <w:szCs w:val="15"/>
+              </w:rPr>
+              <w:t xml:space="preserve">AV:N/AC:H/PR:N/UI:N/S:U/C:H/I:H/A:N</w:t>
+            </w:r>
+          </w:p>
+        </w:tc>
+        <w:tc>
+          <w:tcPr>
+            <w:tcW w:type="dxa" w:w="720"/>
             <w:tcMar>
               <w:top w:type="dxa" w:w="70"/>
               <w:left w:type="dxa" w:w="110"/>
@@ -12666,14 +12741,14 @@
                 <w:sz w:val="20"/>
                 <w:szCs w:val="20"/>
               </w:rPr>
-              <w:t xml:space="preserve">6.5</w:t>
-            </w:r>
-          </w:p>
-        </w:tc>
-        <w:tc>
-          <w:tcPr>
-            <w:tcW w:type="dxa" w:w="1300"/>
-            <w:shd w:fill="B9770E" w:color="auto" w:val="clear"/>
+              <w:t xml:space="preserve">7.4</w:t>
+            </w:r>
+          </w:p>
+        </w:tc>
+        <w:tc>
+          <w:tcPr>
+            <w:tcW w:type="dxa" w:w="1150"/>
+            <w:shd w:fill="C0392B" w:color="auto" w:val="clear"/>
             <w:tcMar>
               <w:top w:type="dxa" w:w="70"/>
               <w:left w:type="dxa" w:w="110"/>
@@ -12695,13 +12770,40 @@
                 <w:sz w:val="20"/>
                 <w:szCs w:val="20"/>
               </w:rPr>
-              <w:t xml:space="preserve">Medium</w:t>
-            </w:r>
-          </w:p>
-        </w:tc>
-        <w:tc>
-          <w:tcPr>
-            <w:tcW w:type="dxa" w:w="3010"/>
+              <w:t xml:space="preserve">High</w:t>
+            </w:r>
+          </w:p>
+        </w:tc>
+        <w:tc>
+          <w:tcPr>
+            <w:tcW w:type="dxa" w:w="2640"/>
+            <w:tcMar>
+              <w:top w:type="dxa" w:w="70"/>
+              <w:left w:type="dxa" w:w="110"/>
+              <w:bottom w:type="dxa" w:w="70"/>
+              <w:right w:type="dxa" w:w="110"/>
+            </w:tcMar>
+            <w:vAlign w:val="center"/>
+          </w:tcPr>
+          <w:p>
+            <w:pPr>
+              <w:spacing w:after="0" w:line="252"/>
+              <w:jc w:val="left"/>
+            </w:pPr>
+            <w:r>
+              <w:rPr>
+                <w:sz w:val="20"/>
+                <w:szCs w:val="20"/>
+              </w:rPr>
+              <w:t xml:space="preserve">Unauthenticated; depends on a guessable password (AC:H). Leads to full account takeover (C:H/I:H).</w:t>
+            </w:r>
+          </w:p>
+        </w:tc>
+      </w:tr>
+      <w:tr>
+        <w:tc>
+          <w:tcPr>
+            <w:tcW w:type="dxa" w:w="900"/>
             <w:shd w:fill="F2F6FB" w:color="auto" w:val="clear"/>
             <w:tcMar>
               <w:top w:type="dxa" w:w="70"/>
@@ -12721,40 +12823,38 @@
                 <w:sz w:val="20"/>
                 <w:szCs w:val="20"/>
               </w:rPr>
-              <w:t xml:space="preserve">Needs only a low-privilege account; discloses all customers’ financial data (C:H). CVSS Medium, business impact High.</w:t>
-            </w:r>
-          </w:p>
-        </w:tc>
-      </w:tr>
-      <w:tr>
-        <w:tc>
-          <w:tcPr>
-            <w:tcW w:type="dxa" w:w="1050"/>
-            <w:tcMar>
-              <w:top w:type="dxa" w:w="70"/>
-              <w:left w:type="dxa" w:w="110"/>
-              <w:bottom w:type="dxa" w:w="70"/>
-              <w:right w:type="dxa" w:w="110"/>
-            </w:tcMar>
-            <w:vAlign w:val="center"/>
-          </w:tcPr>
-          <w:p>
-            <w:pPr>
-              <w:spacing w:after="0" w:line="252"/>
-              <w:jc w:val="left"/>
-            </w:pPr>
-            <w:r>
-              <w:rPr>
-                <w:sz w:val="20"/>
-                <w:szCs w:val="20"/>
-              </w:rPr>
-              <w:t xml:space="preserve">VUL-002</w:t>
-            </w:r>
-          </w:p>
-        </w:tc>
-        <w:tc>
-          <w:tcPr>
-            <w:tcW w:type="dxa" w:w="3150"/>
+              <w:t xml:space="preserve">VUL-001</w:t>
+            </w:r>
+          </w:p>
+        </w:tc>
+        <w:tc>
+          <w:tcPr>
+            <w:tcW w:type="dxa" w:w="1250"/>
+            <w:tcMar>
+              <w:top w:type="dxa" w:w="70"/>
+              <w:left w:type="dxa" w:w="110"/>
+              <w:bottom w:type="dxa" w:w="70"/>
+              <w:right w:type="dxa" w:w="110"/>
+            </w:tcMar>
+            <w:vAlign w:val="center"/>
+          </w:tcPr>
+          <w:p>
+            <w:pPr>
+              <w:spacing w:after="0" w:line="252"/>
+              <w:jc w:val="left"/>
+            </w:pPr>
+            <w:r>
+              <w:rPr>
+                <w:sz w:val="17"/>
+                <w:szCs w:val="17"/>
+              </w:rPr>
+              <w:t xml:space="preserve">CWE-862</w:t>
+            </w:r>
+          </w:p>
+        </w:tc>
+        <w:tc>
+          <w:tcPr>
+            <w:tcW w:type="dxa" w:w="2700"/>
             <w:tcMar>
               <w:top w:type="dxa" w:w="70"/>
               <w:left w:type="dxa" w:w="110"/>
@@ -12771,8 +12871,8 @@
             <w:r>
               <w:rPr>
                 <w:rFonts w:ascii="Consolas" w:cs="Consolas" w:eastAsia="Consolas" w:hAnsi="Consolas"/>
-                <w:sz w:val="16"/>
-                <w:szCs w:val="16"/>
+                <w:sz w:val="15"/>
+                <w:szCs w:val="15"/>
               </w:rPr>
               <w:t xml:space="preserve">AV:N/AC:L/PR:L/UI:N/S:U/C:H/I:N/A:N</w:t>
             </w:r>
@@ -12780,7 +12880,7 @@
         </w:tc>
         <w:tc>
           <w:tcPr>
-            <w:tcW w:type="dxa" w:w="850"/>
+            <w:tcW w:type="dxa" w:w="720"/>
             <w:tcMar>
               <w:top w:type="dxa" w:w="70"/>
               <w:left w:type="dxa" w:w="110"/>
@@ -12807,7 +12907,7 @@
         </w:tc>
         <w:tc>
           <w:tcPr>
-            <w:tcW w:type="dxa" w:w="1300"/>
+            <w:tcW w:type="dxa" w:w="1150"/>
             <w:shd w:fill="B9770E" w:color="auto" w:val="clear"/>
             <w:tcMar>
               <w:top w:type="dxa" w:w="70"/>
@@ -12836,34 +12936,7 @@
         </w:tc>
         <w:tc>
           <w:tcPr>
-            <w:tcW w:type="dxa" w:w="3010"/>
-            <w:tcMar>
-              <w:top w:type="dxa" w:w="70"/>
-              <w:left w:type="dxa" w:w="110"/>
-              <w:bottom w:type="dxa" w:w="70"/>
-              <w:right w:type="dxa" w:w="110"/>
-            </w:tcMar>
-            <w:vAlign w:val="center"/>
-          </w:tcPr>
-          <w:p>
-            <w:pPr>
-              <w:spacing w:after="0" w:line="252"/>
-              <w:jc w:val="left"/>
-            </w:pPr>
-            <w:r>
-              <w:rPr>
-                <w:sz w:val="20"/>
-                <w:szCs w:val="20"/>
-              </w:rPr>
-              <w:t xml:space="preserve">Authenticated customer reads another customer’s sensitive account data (C:H).</w:t>
-            </w:r>
-          </w:p>
-        </w:tc>
-      </w:tr>
-      <w:tr>
-        <w:tc>
-          <w:tcPr>
-            <w:tcW w:type="dxa" w:w="1050"/>
+            <w:tcW w:type="dxa" w:w="2640"/>
             <w:shd w:fill="F2F6FB" w:color="auto" w:val="clear"/>
             <w:tcMar>
               <w:top w:type="dxa" w:w="70"/>
@@ -12883,13 +12956,65 @@
                 <w:sz w:val="20"/>
                 <w:szCs w:val="20"/>
               </w:rPr>
-              <w:t xml:space="preserve">VUL-004</w:t>
-            </w:r>
-          </w:p>
-        </w:tc>
-        <w:tc>
-          <w:tcPr>
-            <w:tcW w:type="dxa" w:w="3150"/>
+              <w:t xml:space="preserve">Low-privilege account discloses all customers’ financial data (C:H). CVSS Medium, business impact High.</w:t>
+            </w:r>
+          </w:p>
+        </w:tc>
+      </w:tr>
+      <w:tr>
+        <w:tc>
+          <w:tcPr>
+            <w:tcW w:type="dxa" w:w="900"/>
+            <w:tcMar>
+              <w:top w:type="dxa" w:w="70"/>
+              <w:left w:type="dxa" w:w="110"/>
+              <w:bottom w:type="dxa" w:w="70"/>
+              <w:right w:type="dxa" w:w="110"/>
+            </w:tcMar>
+            <w:vAlign w:val="center"/>
+          </w:tcPr>
+          <w:p>
+            <w:pPr>
+              <w:spacing w:after="0" w:line="252"/>
+              <w:jc w:val="left"/>
+            </w:pPr>
+            <w:r>
+              <w:rPr>
+                <w:sz w:val="20"/>
+                <w:szCs w:val="20"/>
+              </w:rPr>
+              <w:t xml:space="preserve">VUL-002</w:t>
+            </w:r>
+          </w:p>
+        </w:tc>
+        <w:tc>
+          <w:tcPr>
+            <w:tcW w:type="dxa" w:w="1250"/>
+            <w:tcMar>
+              <w:top w:type="dxa" w:w="70"/>
+              <w:left w:type="dxa" w:w="110"/>
+              <w:bottom w:type="dxa" w:w="70"/>
+              <w:right w:type="dxa" w:w="110"/>
+            </w:tcMar>
+            <w:vAlign w:val="center"/>
+          </w:tcPr>
+          <w:p>
+            <w:pPr>
+              <w:spacing w:after="0" w:line="252"/>
+              <w:jc w:val="left"/>
+            </w:pPr>
+            <w:r>
+              <w:rPr>
+                <w:sz w:val="17"/>
+                <w:szCs w:val="17"/>
+              </w:rPr>
+              <w:t xml:space="preserve">CWE-639</w:t>
+            </w:r>
+          </w:p>
+        </w:tc>
+        <w:tc>
+          <w:tcPr>
+            <w:tcW w:type="dxa" w:w="2700"/>
             <w:tcMar>
               <w:top w:type="dxa" w:w="70"/>
               <w:left w:type="dxa" w:w="110"/>
@@ -12906,16 +13031,16 @@
             <w:r>
               <w:rPr>
                 <w:rFonts w:ascii="Consolas" w:cs="Consolas" w:eastAsia="Consolas" w:hAnsi="Consolas"/>
-                <w:sz w:val="16"/>
-                <w:szCs w:val="16"/>
-              </w:rPr>
-              <w:t xml:space="preserve">AV:N/AC:L/PR:L/UI:R/S:C/C:L/I:L/A:N</w:t>
-            </w:r>
-          </w:p>
-        </w:tc>
-        <w:tc>
-          <w:tcPr>
-            <w:tcW w:type="dxa" w:w="850"/>
+                <w:sz w:val="15"/>
+                <w:szCs w:val="15"/>
+              </w:rPr>
+              <w:t xml:space="preserve">AV:N/AC:L/PR:L/UI:N/S:U/C:H/I:N/A:N</w:t>
+            </w:r>
+          </w:p>
+        </w:tc>
+        <w:tc>
+          <w:tcPr>
+            <w:tcW w:type="dxa" w:w="720"/>
             <w:tcMar>
               <w:top w:type="dxa" w:w="70"/>
               <w:left w:type="dxa" w:w="110"/>
@@ -12936,13 +13061,13 @@
                 <w:sz w:val="20"/>
                 <w:szCs w:val="20"/>
               </w:rPr>
-              <w:t xml:space="preserve">5.4</w:t>
-            </w:r>
-          </w:p>
-        </w:tc>
-        <w:tc>
-          <w:tcPr>
-            <w:tcW w:type="dxa" w:w="1300"/>
+              <w:t xml:space="preserve">6.5</w:t>
+            </w:r>
+          </w:p>
+        </w:tc>
+        <w:tc>
+          <w:tcPr>
+            <w:tcW w:type="dxa" w:w="1150"/>
             <w:shd w:fill="B9770E" w:color="auto" w:val="clear"/>
             <w:tcMar>
               <w:top w:type="dxa" w:w="70"/>
@@ -12971,7 +13096,34 @@
         </w:tc>
         <w:tc>
           <w:tcPr>
-            <w:tcW w:type="dxa" w:w="3010"/>
+            <w:tcW w:type="dxa" w:w="2640"/>
+            <w:tcMar>
+              <w:top w:type="dxa" w:w="70"/>
+              <w:left w:type="dxa" w:w="110"/>
+              <w:bottom w:type="dxa" w:w="70"/>
+              <w:right w:type="dxa" w:w="110"/>
+            </w:tcMar>
+            <w:vAlign w:val="center"/>
+          </w:tcPr>
+          <w:p>
+            <w:pPr>
+              <w:spacing w:after="0" w:line="252"/>
+              <w:jc w:val="left"/>
+            </w:pPr>
+            <w:r>
+              <w:rPr>
+                <w:sz w:val="20"/>
+                <w:szCs w:val="20"/>
+              </w:rPr>
+              <w:t xml:space="preserve">Authenticated customer reads another customer’s sensitive account data (C:H).</w:t>
+            </w:r>
+          </w:p>
+        </w:tc>
+      </w:tr>
+      <w:tr>
+        <w:tc>
+          <w:tcPr>
+            <w:tcW w:type="dxa" w:w="900"/>
             <w:shd w:fill="F2F6FB" w:color="auto" w:val="clear"/>
             <w:tcMar>
               <w:top w:type="dxa" w:w="70"/>
@@ -12991,40 +13143,38 @@
                 <w:sz w:val="20"/>
                 <w:szCs w:val="20"/>
               </w:rPr>
-              <w:t xml:space="preserve">Stored script runs in a victim’s browser (scope change); victim must view the message (UI:R).</w:t>
-            </w:r>
-          </w:p>
-        </w:tc>
-      </w:tr>
-      <w:tr>
-        <w:tc>
-          <w:tcPr>
-            <w:tcW w:type="dxa" w:w="1050"/>
-            <w:tcMar>
-              <w:top w:type="dxa" w:w="70"/>
-              <w:left w:type="dxa" w:w="110"/>
-              <w:bottom w:type="dxa" w:w="70"/>
-              <w:right w:type="dxa" w:w="110"/>
-            </w:tcMar>
-            <w:vAlign w:val="center"/>
-          </w:tcPr>
-          <w:p>
-            <w:pPr>
-              <w:spacing w:after="0" w:line="252"/>
-              <w:jc w:val="left"/>
-            </w:pPr>
-            <w:r>
-              <w:rPr>
-                <w:sz w:val="20"/>
-                <w:szCs w:val="20"/>
-              </w:rPr>
-              <w:t xml:space="preserve">VUL-005</w:t>
-            </w:r>
-          </w:p>
-        </w:tc>
-        <w:tc>
-          <w:tcPr>
-            <w:tcW w:type="dxa" w:w="3150"/>
+              <w:t xml:space="preserve">VUL-004</w:t>
+            </w:r>
+          </w:p>
+        </w:tc>
+        <w:tc>
+          <w:tcPr>
+            <w:tcW w:type="dxa" w:w="1250"/>
+            <w:tcMar>
+              <w:top w:type="dxa" w:w="70"/>
+              <w:left w:type="dxa" w:w="110"/>
+              <w:bottom w:type="dxa" w:w="70"/>
+              <w:right w:type="dxa" w:w="110"/>
+            </w:tcMar>
+            <w:vAlign w:val="center"/>
+          </w:tcPr>
+          <w:p>
+            <w:pPr>
+              <w:spacing w:after="0" w:line="252"/>
+              <w:jc w:val="left"/>
+            </w:pPr>
+            <w:r>
+              <w:rPr>
+                <w:sz w:val="17"/>
+                <w:szCs w:val="17"/>
+              </w:rPr>
+              <w:t xml:space="preserve">CWE-79</w:t>
+            </w:r>
+          </w:p>
+        </w:tc>
+        <w:tc>
+          <w:tcPr>
+            <w:tcW w:type="dxa" w:w="2700"/>
             <w:tcMar>
               <w:top w:type="dxa" w:w="70"/>
               <w:left w:type="dxa" w:w="110"/>
@@ -13041,16 +13191,16 @@
             <w:r>
               <w:rPr>
                 <w:rFonts w:ascii="Consolas" w:cs="Consolas" w:eastAsia="Consolas" w:hAnsi="Consolas"/>
-                <w:sz w:val="16"/>
-                <w:szCs w:val="16"/>
-              </w:rPr>
-              <w:t xml:space="preserve">AV:N/AC:L/PR:N/UI:N/S:U/C:L/I:N/A:N</w:t>
-            </w:r>
-          </w:p>
-        </w:tc>
-        <w:tc>
-          <w:tcPr>
-            <w:tcW w:type="dxa" w:w="850"/>
+                <w:sz w:val="15"/>
+                <w:szCs w:val="15"/>
+              </w:rPr>
+              <w:t xml:space="preserve">AV:N/AC:L/PR:L/UI:R/S:C/C:L/I:L/A:N</w:t>
+            </w:r>
+          </w:p>
+        </w:tc>
+        <w:tc>
+          <w:tcPr>
+            <w:tcW w:type="dxa" w:w="720"/>
             <w:tcMar>
               <w:top w:type="dxa" w:w="70"/>
               <w:left w:type="dxa" w:w="110"/>
@@ -13071,13 +13221,13 @@
                 <w:sz w:val="20"/>
                 <w:szCs w:val="20"/>
               </w:rPr>
-              <w:t xml:space="preserve">5.3</w:t>
-            </w:r>
-          </w:p>
-        </w:tc>
-        <w:tc>
-          <w:tcPr>
-            <w:tcW w:type="dxa" w:w="1300"/>
+              <w:t xml:space="preserve">5.4</w:t>
+            </w:r>
+          </w:p>
+        </w:tc>
+        <w:tc>
+          <w:tcPr>
+            <w:tcW w:type="dxa" w:w="1150"/>
             <w:shd w:fill="B9770E" w:color="auto" w:val="clear"/>
             <w:tcMar>
               <w:top w:type="dxa" w:w="70"/>
@@ -13106,7 +13256,167 @@
         </w:tc>
         <w:tc>
           <w:tcPr>
-            <w:tcW w:type="dxa" w:w="3010"/>
+            <w:tcW w:type="dxa" w:w="2640"/>
+            <w:shd w:fill="F2F6FB" w:color="auto" w:val="clear"/>
+            <w:tcMar>
+              <w:top w:type="dxa" w:w="70"/>
+              <w:left w:type="dxa" w:w="110"/>
+              <w:bottom w:type="dxa" w:w="70"/>
+              <w:right w:type="dxa" w:w="110"/>
+            </w:tcMar>
+            <w:vAlign w:val="center"/>
+          </w:tcPr>
+          <w:p>
+            <w:pPr>
+              <w:spacing w:after="0" w:line="252"/>
+              <w:jc w:val="left"/>
+            </w:pPr>
+            <w:r>
+              <w:rPr>
+                <w:sz w:val="20"/>
+                <w:szCs w:val="20"/>
+              </w:rPr>
+              <w:t xml:space="preserve">Stored script runs in a victim’s browser (scope change); victim must view the message (UI:R).</w:t>
+            </w:r>
+          </w:p>
+        </w:tc>
+      </w:tr>
+      <w:tr>
+        <w:tc>
+          <w:tcPr>
+            <w:tcW w:type="dxa" w:w="900"/>
+            <w:tcMar>
+              <w:top w:type="dxa" w:w="70"/>
+              <w:left w:type="dxa" w:w="110"/>
+              <w:bottom w:type="dxa" w:w="70"/>
+              <w:right w:type="dxa" w:w="110"/>
+            </w:tcMar>
+            <w:vAlign w:val="center"/>
+          </w:tcPr>
+          <w:p>
+            <w:pPr>
+              <w:spacing w:after="0" w:line="252"/>
+              <w:jc w:val="left"/>
+            </w:pPr>
+            <w:r>
+              <w:rPr>
+                <w:sz w:val="20"/>
+                <w:szCs w:val="20"/>
+              </w:rPr>
+              <w:t xml:space="preserve">VUL-005</w:t>
+            </w:r>
+          </w:p>
+        </w:tc>
+        <w:tc>
+          <w:tcPr>
+            <w:tcW w:type="dxa" w:w="1250"/>
+            <w:tcMar>
+              <w:top w:type="dxa" w:w="70"/>
+              <w:left w:type="dxa" w:w="110"/>
+              <w:bottom w:type="dxa" w:w="70"/>
+              <w:right w:type="dxa" w:w="110"/>
+            </w:tcMar>
+            <w:vAlign w:val="center"/>
+          </w:tcPr>
+          <w:p>
+            <w:pPr>
+              <w:spacing w:after="0" w:line="252"/>
+              <w:jc w:val="left"/>
+            </w:pPr>
+            <w:r>
+              <w:rPr>
+                <w:sz w:val="17"/>
+                <w:szCs w:val="17"/>
+              </w:rPr>
+              <w:t xml:space="preserve">CWE-16, 200, 693</w:t>
+            </w:r>
+          </w:p>
+        </w:tc>
+        <w:tc>
+          <w:tcPr>
+            <w:tcW w:type="dxa" w:w="2700"/>
+            <w:tcMar>
+              <w:top w:type="dxa" w:w="70"/>
+              <w:left w:type="dxa" w:w="110"/>
+              <w:bottom w:type="dxa" w:w="70"/>
+              <w:right w:type="dxa" w:w="110"/>
+            </w:tcMar>
+            <w:vAlign w:val="center"/>
+          </w:tcPr>
+          <w:p>
+            <w:pPr>
+              <w:spacing w:after="0" w:line="252"/>
+              <w:jc w:val="left"/>
+            </w:pPr>
+            <w:r>
+              <w:rPr>
+                <w:rFonts w:ascii="Consolas" w:cs="Consolas" w:eastAsia="Consolas" w:hAnsi="Consolas"/>
+                <w:sz w:val="15"/>
+                <w:szCs w:val="15"/>
+              </w:rPr>
+              <w:t xml:space="preserve">AV:N/AC:L/PR:N/UI:N/S:U/C:L/I:N/A:N</w:t>
+            </w:r>
+          </w:p>
+        </w:tc>
+        <w:tc>
+          <w:tcPr>
+            <w:tcW w:type="dxa" w:w="720"/>
+            <w:tcMar>
+              <w:top w:type="dxa" w:w="70"/>
+              <w:left w:type="dxa" w:w="110"/>
+              <w:bottom w:type="dxa" w:w="70"/>
+              <w:right w:type="dxa" w:w="110"/>
+            </w:tcMar>
+            <w:vAlign w:val="center"/>
+          </w:tcPr>
+          <w:p>
+            <w:pPr>
+              <w:spacing w:after="0" w:line="252"/>
+              <w:jc w:val="center"/>
+            </w:pPr>
+            <w:r>
+              <w:rPr>
+                <w:b/>
+                <w:bCs/>
+                <w:sz w:val="20"/>
+                <w:szCs w:val="20"/>
+              </w:rPr>
+              <w:t xml:space="preserve">5.3</w:t>
+            </w:r>
+          </w:p>
+        </w:tc>
+        <w:tc>
+          <w:tcPr>
+            <w:tcW w:type="dxa" w:w="1150"/>
+            <w:shd w:fill="B9770E" w:color="auto" w:val="clear"/>
+            <w:tcMar>
+              <w:top w:type="dxa" w:w="70"/>
+              <w:left w:type="dxa" w:w="110"/>
+              <w:bottom w:type="dxa" w:w="70"/>
+              <w:right w:type="dxa" w:w="110"/>
+            </w:tcMar>
+            <w:vAlign w:val="center"/>
+          </w:tcPr>
+          <w:p>
+            <w:pPr>
+              <w:spacing w:after="0" w:line="252"/>
+              <w:jc w:val="center"/>
+            </w:pPr>
+            <w:r>
+              <w:rPr>
+                <w:b/>
+                <w:bCs/>
+                <w:color w:val="FFFFFF"/>
+                <w:sz w:val="20"/>
+                <w:szCs w:val="20"/>
+              </w:rPr>
+              <w:t xml:space="preserve">Medium</w:t>
+            </w:r>
+          </w:p>
+        </w:tc>
+        <w:tc>
+          <w:tcPr>
+            <w:tcW w:type="dxa" w:w="2640"/>
             <w:tcMar>
               <w:top w:type="dxa" w:w="70"/>
               <w:left w:type="dxa" w:w="110"/>
@@ -13226,10 +13536,11 @@
         </w:tblBorders>
       </w:tblPr>
       <w:tblGrid>
-        <w:gridCol w:w="1050"/>
-        <w:gridCol w:w="2500"/>
-        <w:gridCol w:w="4510"/>
-        <w:gridCol w:w="1300"/>
+        <w:gridCol w:w="800"/>
+        <w:gridCol w:w="1150"/>
+        <w:gridCol w:w="2150"/>
+        <w:gridCol w:w="4060"/>
+        <w:gridCol w:w="1200"/>
       </w:tblGrid>
       <w:tr>
         <w:trPr>
@@ -13237,7 +13548,7 @@
         </w:trPr>
         <w:tc>
           <w:tcPr>
-            <w:tcW w:type="dxa" w:w="1050"/>
+            <w:tcW w:type="dxa" w:w="800"/>
             <w:shd w:fill="1F3A5F" w:color="auto" w:val="clear"/>
             <w:tcMar>
               <w:top w:type="dxa" w:w="70"/>
@@ -13266,7 +13577,7 @@
         </w:tc>
         <w:tc>
           <w:tcPr>
-            <w:tcW w:type="dxa" w:w="2500"/>
+            <w:tcW w:type="dxa" w:w="1150"/>
             <w:shd w:fill="1F3A5F" w:color="auto" w:val="clear"/>
             <w:tcMar>
               <w:top w:type="dxa" w:w="70"/>
@@ -13289,13 +13600,13 @@
                 <w:sz w:val="20"/>
                 <w:szCs w:val="20"/>
               </w:rPr>
-              <w:t xml:space="preserve">Root cause</w:t>
-            </w:r>
-          </w:p>
-        </w:tc>
-        <w:tc>
-          <w:tcPr>
-            <w:tcW w:type="dxa" w:w="4510"/>
+              <w:t xml:space="preserve">CWE</w:t>
+            </w:r>
+          </w:p>
+        </w:tc>
+        <w:tc>
+          <w:tcPr>
+            <w:tcW w:type="dxa" w:w="2150"/>
             <w:shd w:fill="1F3A5F" w:color="auto" w:val="clear"/>
             <w:tcMar>
               <w:top w:type="dxa" w:w="70"/>
@@ -13318,13 +13629,13 @@
                 <w:sz w:val="20"/>
                 <w:szCs w:val="20"/>
               </w:rPr>
-              <w:t xml:space="preserve">Recommended fix</w:t>
-            </w:r>
-          </w:p>
-        </w:tc>
-        <w:tc>
-          <w:tcPr>
-            <w:tcW w:type="dxa" w:w="1300"/>
+              <w:t xml:space="preserve">Root cause</w:t>
+            </w:r>
+          </w:p>
+        </w:tc>
+        <w:tc>
+          <w:tcPr>
+            <w:tcW w:type="dxa" w:w="4060"/>
             <w:shd w:fill="1F3A5F" w:color="auto" w:val="clear"/>
             <w:tcMar>
               <w:top w:type="dxa" w:w="70"/>
@@ -13347,103 +13658,26 @@
                 <w:sz w:val="20"/>
                 <w:szCs w:val="20"/>
               </w:rPr>
-              <w:t xml:space="preserve">Priority</w:t>
-            </w:r>
-          </w:p>
-        </w:tc>
-      </w:tr>
-      <w:tr>
-        <w:tc>
-          <w:tcPr>
-            <w:tcW w:type="dxa" w:w="1050"/>
-            <w:tcMar>
-              <w:top w:type="dxa" w:w="70"/>
-              <w:left w:type="dxa" w:w="110"/>
-              <w:bottom w:type="dxa" w:w="70"/>
-              <w:right w:type="dxa" w:w="110"/>
-            </w:tcMar>
-            <w:vAlign w:val="center"/>
-          </w:tcPr>
-          <w:p>
-            <w:pPr>
-              <w:spacing w:after="0" w:line="252"/>
-              <w:jc w:val="left"/>
-            </w:pPr>
-            <w:r>
-              <w:rPr>
-                <w:sz w:val="20"/>
-                <w:szCs w:val="20"/>
-              </w:rPr>
-              <w:t xml:space="preserve">VUL-001</w:t>
-            </w:r>
-          </w:p>
-        </w:tc>
-        <w:tc>
-          <w:tcPr>
-            <w:tcW w:type="dxa" w:w="2500"/>
-            <w:tcMar>
-              <w:top w:type="dxa" w:w="70"/>
-              <w:left w:type="dxa" w:w="110"/>
-              <w:bottom w:type="dxa" w:w="70"/>
-              <w:right w:type="dxa" w:w="110"/>
-            </w:tcMar>
-            <w:vAlign w:val="center"/>
-          </w:tcPr>
-          <w:p>
-            <w:pPr>
-              <w:spacing w:after="0" w:line="252"/>
-              <w:jc w:val="left"/>
-            </w:pPr>
-            <w:r>
-              <w:rPr>
-                <w:sz w:val="20"/>
-                <w:szCs w:val="20"/>
-              </w:rPr>
-              <w:t xml:space="preserve">Operations endpoint performs no server-side authorisation</w:t>
-            </w:r>
-          </w:p>
-        </w:tc>
-        <w:tc>
-          <w:tcPr>
-            <w:tcW w:type="dxa" w:w="4510"/>
-            <w:tcMar>
-              <w:top w:type="dxa" w:w="70"/>
-              <w:left w:type="dxa" w:w="110"/>
-              <w:bottom w:type="dxa" w:w="70"/>
-              <w:right w:type="dxa" w:w="110"/>
-            </w:tcMar>
-            <w:vAlign w:val="center"/>
-          </w:tcPr>
-          <w:p>
-            <w:pPr>
-              <w:spacing w:after="0" w:line="252"/>
-              <w:jc w:val="left"/>
-            </w:pPr>
-            <w:r>
-              <w:rPr>
-                <w:sz w:val="20"/>
-                <w:szCs w:val="20"/>
-              </w:rPr>
-              <w:t xml:space="preserve">Enforce role-based authorisation on the server for /api/operations; deny by default; return 403 to non-staff; never rely on hidden UI menus</w:t>
-            </w:r>
-          </w:p>
-        </w:tc>
-        <w:tc>
-          <w:tcPr>
-            <w:tcW w:type="dxa" w:w="1300"/>
-            <w:shd w:fill="C0392B" w:color="auto" w:val="clear"/>
-            <w:tcMar>
-              <w:top w:type="dxa" w:w="70"/>
-              <w:left w:type="dxa" w:w="110"/>
-              <w:bottom w:type="dxa" w:w="70"/>
-              <w:right w:type="dxa" w:w="110"/>
-            </w:tcMar>
-            <w:vAlign w:val="center"/>
-          </w:tcPr>
-          <w:p>
-            <w:pPr>
-              <w:spacing w:after="0" w:line="252"/>
-              <w:jc w:val="center"/>
+              <w:t xml:space="preserve">Recommended fix</w:t>
+            </w:r>
+          </w:p>
+        </w:tc>
+        <w:tc>
+          <w:tcPr>
+            <w:tcW w:type="dxa" w:w="1200"/>
+            <w:shd w:fill="1F3A5F" w:color="auto" w:val="clear"/>
+            <w:tcMar>
+              <w:top w:type="dxa" w:w="70"/>
+              <w:left w:type="dxa" w:w="110"/>
+              <w:bottom w:type="dxa" w:w="70"/>
+              <w:right w:type="dxa" w:w="110"/>
+            </w:tcMar>
+            <w:vAlign w:val="center"/>
+          </w:tcPr>
+          <w:p>
+            <w:pPr>
+              <w:spacing w:after="0" w:line="252"/>
+              <w:jc w:val="left"/>
             </w:pPr>
             <w:r>
               <w:rPr>
@@ -13453,93 +13687,115 @@
                 <w:sz w:val="20"/>
                 <w:szCs w:val="20"/>
               </w:rPr>
-              <w:t xml:space="preserve">High</w:t>
-            </w:r>
-          </w:p>
-        </w:tc>
-      </w:tr>
-      <w:tr>
-        <w:tc>
-          <w:tcPr>
-            <w:tcW w:type="dxa" w:w="1050"/>
-            <w:shd w:fill="F2F6FB" w:color="auto" w:val="clear"/>
-            <w:tcMar>
-              <w:top w:type="dxa" w:w="70"/>
-              <w:left w:type="dxa" w:w="110"/>
-              <w:bottom w:type="dxa" w:w="70"/>
-              <w:right w:type="dxa" w:w="110"/>
-            </w:tcMar>
-            <w:vAlign w:val="center"/>
-          </w:tcPr>
-          <w:p>
-            <w:pPr>
-              <w:spacing w:after="0" w:line="252"/>
-              <w:jc w:val="left"/>
-            </w:pPr>
-            <w:r>
-              <w:rPr>
-                <w:sz w:val="20"/>
-                <w:szCs w:val="20"/>
-              </w:rPr>
-              <w:t xml:space="preserve">VUL-002</w:t>
-            </w:r>
-          </w:p>
-        </w:tc>
-        <w:tc>
-          <w:tcPr>
-            <w:tcW w:type="dxa" w:w="2500"/>
-            <w:shd w:fill="F2F6FB" w:color="auto" w:val="clear"/>
-            <w:tcMar>
-              <w:top w:type="dxa" w:w="70"/>
-              <w:left w:type="dxa" w:w="110"/>
-              <w:bottom w:type="dxa" w:w="70"/>
-              <w:right w:type="dxa" w:w="110"/>
-            </w:tcMar>
-            <w:vAlign w:val="center"/>
-          </w:tcPr>
-          <w:p>
-            <w:pPr>
-              <w:spacing w:after="0" w:line="252"/>
-              <w:jc w:val="left"/>
-            </w:pPr>
-            <w:r>
-              <w:rPr>
-                <w:sz w:val="20"/>
-                <w:szCs w:val="20"/>
-              </w:rPr>
-              <w:t xml:space="preserve">Object ownership not checked before returning the record</w:t>
-            </w:r>
-          </w:p>
-        </w:tc>
-        <w:tc>
-          <w:tcPr>
-            <w:tcW w:type="dxa" w:w="4510"/>
-            <w:shd w:fill="F2F6FB" w:color="auto" w:val="clear"/>
-            <w:tcMar>
-              <w:top w:type="dxa" w:w="70"/>
-              <w:left w:type="dxa" w:w="110"/>
-              <w:bottom w:type="dxa" w:w="70"/>
-              <w:right w:type="dxa" w:w="110"/>
-            </w:tcMar>
-            <w:vAlign w:val="center"/>
-          </w:tcPr>
-          <w:p>
-            <w:pPr>
-              <w:spacing w:after="0" w:line="252"/>
-              <w:jc w:val="left"/>
-            </w:pPr>
-            <w:r>
-              <w:rPr>
-                <w:sz w:val="20"/>
-                <w:szCs w:val="20"/>
-              </w:rPr>
-              <w:t xml:space="preserve">Verify the requested account’s owner equals the authenticated user before responding; add automated access-control tests</w:t>
-            </w:r>
-          </w:p>
-        </w:tc>
-        <w:tc>
-          <w:tcPr>
-            <w:tcW w:type="dxa" w:w="1300"/>
+              <w:t xml:space="preserve">Priority</w:t>
+            </w:r>
+          </w:p>
+        </w:tc>
+      </w:tr>
+      <w:tr>
+        <w:tc>
+          <w:tcPr>
+            <w:tcW w:type="dxa" w:w="800"/>
+            <w:tcMar>
+              <w:top w:type="dxa" w:w="70"/>
+              <w:left w:type="dxa" w:w="110"/>
+              <w:bottom w:type="dxa" w:w="70"/>
+              <w:right w:type="dxa" w:w="110"/>
+            </w:tcMar>
+            <w:vAlign w:val="center"/>
+          </w:tcPr>
+          <w:p>
+            <w:pPr>
+              <w:spacing w:after="0" w:line="252"/>
+              <w:jc w:val="left"/>
+            </w:pPr>
+            <w:r>
+              <w:rPr>
+                <w:sz w:val="20"/>
+                <w:szCs w:val="20"/>
+              </w:rPr>
+              <w:t xml:space="preserve">VUL-001</w:t>
+            </w:r>
+          </w:p>
+        </w:tc>
+        <w:tc>
+          <w:tcPr>
+            <w:tcW w:type="dxa" w:w="1150"/>
+            <w:tcMar>
+              <w:top w:type="dxa" w:w="70"/>
+              <w:left w:type="dxa" w:w="110"/>
+              <w:bottom w:type="dxa" w:w="70"/>
+              <w:right w:type="dxa" w:w="110"/>
+            </w:tcMar>
+            <w:vAlign w:val="center"/>
+          </w:tcPr>
+          <w:p>
+            <w:pPr>
+              <w:spacing w:after="0" w:line="252"/>
+              <w:jc w:val="left"/>
+            </w:pPr>
+            <w:r>
+              <w:rPr>
+                <w:sz w:val="18"/>
+                <w:szCs w:val="18"/>
+              </w:rPr>
+              <w:t xml:space="preserve">CWE-862</w:t>
+            </w:r>
+          </w:p>
+        </w:tc>
+        <w:tc>
+          <w:tcPr>
+            <w:tcW w:type="dxa" w:w="2150"/>
+            <w:tcMar>
+              <w:top w:type="dxa" w:w="70"/>
+              <w:left w:type="dxa" w:w="110"/>
+              <w:bottom w:type="dxa" w:w="70"/>
+              <w:right w:type="dxa" w:w="110"/>
+            </w:tcMar>
+            <w:vAlign w:val="center"/>
+          </w:tcPr>
+          <w:p>
+            <w:pPr>
+              <w:spacing w:after="0" w:line="252"/>
+              <w:jc w:val="left"/>
+            </w:pPr>
+            <w:r>
+              <w:rPr>
+                <w:sz w:val="20"/>
+                <w:szCs w:val="20"/>
+              </w:rPr>
+              <w:t xml:space="preserve">Operations endpoint performs no server-side authorisation</w:t>
+            </w:r>
+          </w:p>
+        </w:tc>
+        <w:tc>
+          <w:tcPr>
+            <w:tcW w:type="dxa" w:w="4060"/>
+            <w:tcMar>
+              <w:top w:type="dxa" w:w="70"/>
+              <w:left w:type="dxa" w:w="110"/>
+              <w:bottom w:type="dxa" w:w="70"/>
+              <w:right w:type="dxa" w:w="110"/>
+            </w:tcMar>
+            <w:vAlign w:val="center"/>
+          </w:tcPr>
+          <w:p>
+            <w:pPr>
+              <w:spacing w:after="0" w:line="252"/>
+              <w:jc w:val="left"/>
+            </w:pPr>
+            <w:r>
+              <w:rPr>
+                <w:sz w:val="20"/>
+                <w:szCs w:val="20"/>
+              </w:rPr>
+              <w:t xml:space="preserve">Enforce role-based authorisation on the server for /api/operations; deny by default; return 403 to non-staff; never rely on hidden UI menus</w:t>
+            </w:r>
+          </w:p>
+        </w:tc>
+        <w:tc>
+          <w:tcPr>
+            <w:tcW w:type="dxa" w:w="1200"/>
             <w:shd w:fill="C0392B" w:color="auto" w:val="clear"/>
             <w:tcMar>
               <w:top w:type="dxa" w:w="70"/>
@@ -13570,82 +13826,110 @@
       <w:tr>
         <w:tc>
           <w:tcPr>
-            <w:tcW w:type="dxa" w:w="1050"/>
-            <w:tcMar>
-              <w:top w:type="dxa" w:w="70"/>
-              <w:left w:type="dxa" w:w="110"/>
-              <w:bottom w:type="dxa" w:w="70"/>
-              <w:right w:type="dxa" w:w="110"/>
-            </w:tcMar>
-            <w:vAlign w:val="center"/>
-          </w:tcPr>
-          <w:p>
-            <w:pPr>
-              <w:spacing w:after="0" w:line="252"/>
-              <w:jc w:val="left"/>
-            </w:pPr>
-            <w:r>
-              <w:rPr>
-                <w:sz w:val="20"/>
-                <w:szCs w:val="20"/>
-              </w:rPr>
-              <w:t xml:space="preserve">VUL-003</w:t>
-            </w:r>
-          </w:p>
-        </w:tc>
-        <w:tc>
-          <w:tcPr>
-            <w:tcW w:type="dxa" w:w="2500"/>
-            <w:tcMar>
-              <w:top w:type="dxa" w:w="70"/>
-              <w:left w:type="dxa" w:w="110"/>
-              <w:bottom w:type="dxa" w:w="70"/>
-              <w:right w:type="dxa" w:w="110"/>
-            </w:tcMar>
-            <w:vAlign w:val="center"/>
-          </w:tcPr>
-          <w:p>
-            <w:pPr>
-              <w:spacing w:after="0" w:line="252"/>
-              <w:jc w:val="left"/>
-            </w:pPr>
-            <w:r>
-              <w:rPr>
-                <w:sz w:val="20"/>
-                <w:szCs w:val="20"/>
-              </w:rPr>
-              <w:t xml:space="preserve">No anti-automation on the login endpoint</w:t>
-            </w:r>
-          </w:p>
-        </w:tc>
-        <w:tc>
-          <w:tcPr>
-            <w:tcW w:type="dxa" w:w="4510"/>
-            <w:tcMar>
-              <w:top w:type="dxa" w:w="70"/>
-              <w:left w:type="dxa" w:w="110"/>
-              <w:bottom w:type="dxa" w:w="70"/>
-              <w:right w:type="dxa" w:w="110"/>
-            </w:tcMar>
-            <w:vAlign w:val="center"/>
-          </w:tcPr>
-          <w:p>
-            <w:pPr>
-              <w:spacing w:after="0" w:line="252"/>
-              <w:jc w:val="left"/>
-            </w:pPr>
-            <w:r>
-              <w:rPr>
-                <w:sz w:val="20"/>
-                <w:szCs w:val="20"/>
-              </w:rPr>
-              <w:t xml:space="preserve">Add rate limiting + temporary lockout/back-off; CAPTCHA after N failures; strong password policy; remove default passwords; consider MFA; log and alert on brute force</w:t>
-            </w:r>
-          </w:p>
-        </w:tc>
-        <w:tc>
-          <w:tcPr>
-            <w:tcW w:type="dxa" w:w="1300"/>
+            <w:tcW w:type="dxa" w:w="800"/>
+            <w:shd w:fill="F2F6FB" w:color="auto" w:val="clear"/>
+            <w:tcMar>
+              <w:top w:type="dxa" w:w="70"/>
+              <w:left w:type="dxa" w:w="110"/>
+              <w:bottom w:type="dxa" w:w="70"/>
+              <w:right w:type="dxa" w:w="110"/>
+            </w:tcMar>
+            <w:vAlign w:val="center"/>
+          </w:tcPr>
+          <w:p>
+            <w:pPr>
+              <w:spacing w:after="0" w:line="252"/>
+              <w:jc w:val="left"/>
+            </w:pPr>
+            <w:r>
+              <w:rPr>
+                <w:sz w:val="20"/>
+                <w:szCs w:val="20"/>
+              </w:rPr>
+              <w:t xml:space="preserve">VUL-002</w:t>
+            </w:r>
+          </w:p>
+        </w:tc>
+        <w:tc>
+          <w:tcPr>
+            <w:tcW w:type="dxa" w:w="1150"/>
+            <w:tcMar>
+              <w:top w:type="dxa" w:w="70"/>
+              <w:left w:type="dxa" w:w="110"/>
+              <w:bottom w:type="dxa" w:w="70"/>
+              <w:right w:type="dxa" w:w="110"/>
+            </w:tcMar>
+            <w:vAlign w:val="center"/>
+          </w:tcPr>
+          <w:p>
+            <w:pPr>
+              <w:spacing w:after="0" w:line="252"/>
+              <w:jc w:val="left"/>
+            </w:pPr>
+            <w:r>
+              <w:rPr>
+                <w:sz w:val="18"/>
+                <w:szCs w:val="18"/>
+              </w:rPr>
+              <w:t xml:space="preserve">CWE-639</w:t>
+            </w:r>
+          </w:p>
+        </w:tc>
+        <w:tc>
+          <w:tcPr>
+            <w:tcW w:type="dxa" w:w="2150"/>
+            <w:shd w:fill="F2F6FB" w:color="auto" w:val="clear"/>
+            <w:tcMar>
+              <w:top w:type="dxa" w:w="70"/>
+              <w:left w:type="dxa" w:w="110"/>
+              <w:bottom w:type="dxa" w:w="70"/>
+              <w:right w:type="dxa" w:w="110"/>
+            </w:tcMar>
+            <w:vAlign w:val="center"/>
+          </w:tcPr>
+          <w:p>
+            <w:pPr>
+              <w:spacing w:after="0" w:line="252"/>
+              <w:jc w:val="left"/>
+            </w:pPr>
+            <w:r>
+              <w:rPr>
+                <w:sz w:val="20"/>
+                <w:szCs w:val="20"/>
+              </w:rPr>
+              <w:t xml:space="preserve">Object ownership not checked before returning the record</w:t>
+            </w:r>
+          </w:p>
+        </w:tc>
+        <w:tc>
+          <w:tcPr>
+            <w:tcW w:type="dxa" w:w="4060"/>
+            <w:shd w:fill="F2F6FB" w:color="auto" w:val="clear"/>
+            <w:tcMar>
+              <w:top w:type="dxa" w:w="70"/>
+              <w:left w:type="dxa" w:w="110"/>
+              <w:bottom w:type="dxa" w:w="70"/>
+              <w:right w:type="dxa" w:w="110"/>
+            </w:tcMar>
+            <w:vAlign w:val="center"/>
+          </w:tcPr>
+          <w:p>
+            <w:pPr>
+              <w:spacing w:after="0" w:line="252"/>
+              <w:jc w:val="left"/>
+            </w:pPr>
+            <w:r>
+              <w:rPr>
+                <w:sz w:val="20"/>
+                <w:szCs w:val="20"/>
+              </w:rPr>
+              <w:t xml:space="preserve">Verify the requested account’s owner equals the authenticated user before responding; add automated access-control tests</w:t>
+            </w:r>
+          </w:p>
+        </w:tc>
+        <w:tc>
+          <w:tcPr>
+            <w:tcW w:type="dxa" w:w="1200"/>
             <w:shd w:fill="C0392B" w:color="auto" w:val="clear"/>
             <w:tcMar>
               <w:top w:type="dxa" w:w="70"/>
@@ -13676,85 +13960,107 @@
       <w:tr>
         <w:tc>
           <w:tcPr>
-            <w:tcW w:type="dxa" w:w="1050"/>
-            <w:shd w:fill="F2F6FB" w:color="auto" w:val="clear"/>
-            <w:tcMar>
-              <w:top w:type="dxa" w:w="70"/>
-              <w:left w:type="dxa" w:w="110"/>
-              <w:bottom w:type="dxa" w:w="70"/>
-              <w:right w:type="dxa" w:w="110"/>
-            </w:tcMar>
-            <w:vAlign w:val="center"/>
-          </w:tcPr>
-          <w:p>
-            <w:pPr>
-              <w:spacing w:after="0" w:line="252"/>
-              <w:jc w:val="left"/>
-            </w:pPr>
-            <w:r>
-              <w:rPr>
-                <w:sz w:val="20"/>
-                <w:szCs w:val="20"/>
-              </w:rPr>
-              <w:t xml:space="preserve">VUL-004</w:t>
-            </w:r>
-          </w:p>
-        </w:tc>
-        <w:tc>
-          <w:tcPr>
-            <w:tcW w:type="dxa" w:w="2500"/>
-            <w:shd w:fill="F2F6FB" w:color="auto" w:val="clear"/>
-            <w:tcMar>
-              <w:top w:type="dxa" w:w="70"/>
-              <w:left w:type="dxa" w:w="110"/>
-              <w:bottom w:type="dxa" w:w="70"/>
-              <w:right w:type="dxa" w:w="110"/>
-            </w:tcMar>
-            <w:vAlign w:val="center"/>
-          </w:tcPr>
-          <w:p>
-            <w:pPr>
-              <w:spacing w:after="0" w:line="252"/>
-              <w:jc w:val="left"/>
-            </w:pPr>
-            <w:r>
-              <w:rPr>
-                <w:sz w:val="20"/>
-                <w:szCs w:val="20"/>
-              </w:rPr>
-              <w:t xml:space="preserve">User input rendered without output encoding</w:t>
-            </w:r>
-          </w:p>
-        </w:tc>
-        <w:tc>
-          <w:tcPr>
-            <w:tcW w:type="dxa" w:w="4510"/>
-            <w:shd w:fill="F2F6FB" w:color="auto" w:val="clear"/>
-            <w:tcMar>
-              <w:top w:type="dxa" w:w="70"/>
-              <w:left w:type="dxa" w:w="110"/>
-              <w:bottom w:type="dxa" w:w="70"/>
-              <w:right w:type="dxa" w:w="110"/>
-            </w:tcMar>
-            <w:vAlign w:val="center"/>
-          </w:tcPr>
-          <w:p>
-            <w:pPr>
-              <w:spacing w:after="0" w:line="252"/>
-              <w:jc w:val="left"/>
-            </w:pPr>
-            <w:r>
-              <w:rPr>
-                <w:sz w:val="20"/>
-                <w:szCs w:val="20"/>
-              </w:rPr>
-              <w:t xml:space="preserve">Apply contextual output encoding/escaping; rely on framework auto-escaping; sanitise any rich text (e.g. DOMPurify); add a Content-Security-Policy</w:t>
-            </w:r>
-          </w:p>
-        </w:tc>
-        <w:tc>
-          <w:tcPr>
-            <w:tcW w:type="dxa" w:w="1300"/>
+            <w:tcW w:type="dxa" w:w="800"/>
+            <w:tcMar>
+              <w:top w:type="dxa" w:w="70"/>
+              <w:left w:type="dxa" w:w="110"/>
+              <w:bottom w:type="dxa" w:w="70"/>
+              <w:right w:type="dxa" w:w="110"/>
+            </w:tcMar>
+            <w:vAlign w:val="center"/>
+          </w:tcPr>
+          <w:p>
+            <w:pPr>
+              <w:spacing w:after="0" w:line="252"/>
+              <w:jc w:val="left"/>
+            </w:pPr>
+            <w:r>
+              <w:rPr>
+                <w:sz w:val="20"/>
+                <w:szCs w:val="20"/>
+              </w:rPr>
+              <w:t xml:space="preserve">VUL-003</w:t>
+            </w:r>
+          </w:p>
+        </w:tc>
+        <w:tc>
+          <w:tcPr>
+            <w:tcW w:type="dxa" w:w="1150"/>
+            <w:tcMar>
+              <w:top w:type="dxa" w:w="70"/>
+              <w:left w:type="dxa" w:w="110"/>
+              <w:bottom w:type="dxa" w:w="70"/>
+              <w:right w:type="dxa" w:w="110"/>
+            </w:tcMar>
+            <w:vAlign w:val="center"/>
+          </w:tcPr>
+          <w:p>
+            <w:pPr>
+              <w:spacing w:after="0" w:line="252"/>
+              <w:jc w:val="left"/>
+            </w:pPr>
+            <w:r>
+              <w:rPr>
+                <w:sz w:val="18"/>
+                <w:szCs w:val="18"/>
+              </w:rPr>
+              <w:t xml:space="preserve">CWE-307</w:t>
+            </w:r>
+          </w:p>
+        </w:tc>
+        <w:tc>
+          <w:tcPr>
+            <w:tcW w:type="dxa" w:w="2150"/>
+            <w:tcMar>
+              <w:top w:type="dxa" w:w="70"/>
+              <w:left w:type="dxa" w:w="110"/>
+              <w:bottom w:type="dxa" w:w="70"/>
+              <w:right w:type="dxa" w:w="110"/>
+            </w:tcMar>
+            <w:vAlign w:val="center"/>
+          </w:tcPr>
+          <w:p>
+            <w:pPr>
+              <w:spacing w:after="0" w:line="252"/>
+              <w:jc w:val="left"/>
+            </w:pPr>
+            <w:r>
+              <w:rPr>
+                <w:sz w:val="20"/>
+                <w:szCs w:val="20"/>
+              </w:rPr>
+              <w:t xml:space="preserve">No anti-automation on the login endpoint</w:t>
+            </w:r>
+          </w:p>
+        </w:tc>
+        <w:tc>
+          <w:tcPr>
+            <w:tcW w:type="dxa" w:w="4060"/>
+            <w:tcMar>
+              <w:top w:type="dxa" w:w="70"/>
+              <w:left w:type="dxa" w:w="110"/>
+              <w:bottom w:type="dxa" w:w="70"/>
+              <w:right w:type="dxa" w:w="110"/>
+            </w:tcMar>
+            <w:vAlign w:val="center"/>
+          </w:tcPr>
+          <w:p>
+            <w:pPr>
+              <w:spacing w:after="0" w:line="252"/>
+              <w:jc w:val="left"/>
+            </w:pPr>
+            <w:r>
+              <w:rPr>
+                <w:sz w:val="20"/>
+                <w:szCs w:val="20"/>
+              </w:rPr>
+              <w:t xml:space="preserve">Add rate limiting + temporary lockout/back-off; CAPTCHA after N failures; strong password policy; remove default passwords; consider MFA; log and alert on brute force</w:t>
+            </w:r>
+          </w:p>
+        </w:tc>
+        <w:tc>
+          <w:tcPr>
+            <w:tcW w:type="dxa" w:w="1200"/>
             <w:shd w:fill="C0392B" w:color="auto" w:val="clear"/>
             <w:tcMar>
               <w:top w:type="dxa" w:w="70"/>
@@ -13785,7 +14091,141 @@
       <w:tr>
         <w:tc>
           <w:tcPr>
-            <w:tcW w:type="dxa" w:w="1050"/>
+            <w:tcW w:type="dxa" w:w="800"/>
+            <w:shd w:fill="F2F6FB" w:color="auto" w:val="clear"/>
+            <w:tcMar>
+              <w:top w:type="dxa" w:w="70"/>
+              <w:left w:type="dxa" w:w="110"/>
+              <w:bottom w:type="dxa" w:w="70"/>
+              <w:right w:type="dxa" w:w="110"/>
+            </w:tcMar>
+            <w:vAlign w:val="center"/>
+          </w:tcPr>
+          <w:p>
+            <w:pPr>
+              <w:spacing w:after="0" w:line="252"/>
+              <w:jc w:val="left"/>
+            </w:pPr>
+            <w:r>
+              <w:rPr>
+                <w:sz w:val="20"/>
+                <w:szCs w:val="20"/>
+              </w:rPr>
+              <w:t xml:space="preserve">VUL-004</w:t>
+            </w:r>
+          </w:p>
+        </w:tc>
+        <w:tc>
+          <w:tcPr>
+            <w:tcW w:type="dxa" w:w="1150"/>
+            <w:tcMar>
+              <w:top w:type="dxa" w:w="70"/>
+              <w:left w:type="dxa" w:w="110"/>
+              <w:bottom w:type="dxa" w:w="70"/>
+              <w:right w:type="dxa" w:w="110"/>
+            </w:tcMar>
+            <w:vAlign w:val="center"/>
+          </w:tcPr>
+          <w:p>
+            <w:pPr>
+              <w:spacing w:after="0" w:line="252"/>
+              <w:jc w:val="left"/>
+            </w:pPr>
+            <w:r>
+              <w:rPr>
+                <w:sz w:val="18"/>
+                <w:szCs w:val="18"/>
+              </w:rPr>
+              <w:t xml:space="preserve">CWE-79</w:t>
+            </w:r>
+          </w:p>
+        </w:tc>
+        <w:tc>
+          <w:tcPr>
+            <w:tcW w:type="dxa" w:w="2150"/>
+            <w:shd w:fill="F2F6FB" w:color="auto" w:val="clear"/>
+            <w:tcMar>
+              <w:top w:type="dxa" w:w="70"/>
+              <w:left w:type="dxa" w:w="110"/>
+              <w:bottom w:type="dxa" w:w="70"/>
+              <w:right w:type="dxa" w:w="110"/>
+            </w:tcMar>
+            <w:vAlign w:val="center"/>
+          </w:tcPr>
+          <w:p>
+            <w:pPr>
+              <w:spacing w:after="0" w:line="252"/>
+              <w:jc w:val="left"/>
+            </w:pPr>
+            <w:r>
+              <w:rPr>
+                <w:sz w:val="20"/>
+                <w:szCs w:val="20"/>
+              </w:rPr>
+              <w:t xml:space="preserve">User input rendered without output encoding</w:t>
+            </w:r>
+          </w:p>
+        </w:tc>
+        <w:tc>
+          <w:tcPr>
+            <w:tcW w:type="dxa" w:w="4060"/>
+            <w:shd w:fill="F2F6FB" w:color="auto" w:val="clear"/>
+            <w:tcMar>
+              <w:top w:type="dxa" w:w="70"/>
+              <w:left w:type="dxa" w:w="110"/>
+              <w:bottom w:type="dxa" w:w="70"/>
+              <w:right w:type="dxa" w:w="110"/>
+            </w:tcMar>
+            <w:vAlign w:val="center"/>
+          </w:tcPr>
+          <w:p>
+            <w:pPr>
+              <w:spacing w:after="0" w:line="252"/>
+              <w:jc w:val="left"/>
+            </w:pPr>
+            <w:r>
+              <w:rPr>
+                <w:sz w:val="20"/>
+                <w:szCs w:val="20"/>
+              </w:rPr>
+              <w:t xml:space="preserve">Apply contextual output encoding/escaping; rely on framework auto-escaping; sanitise any rich text (e.g. DOMPurify); add a Content-Security-Policy</w:t>
+            </w:r>
+          </w:p>
+        </w:tc>
+        <w:tc>
+          <w:tcPr>
+            <w:tcW w:type="dxa" w:w="1200"/>
+            <w:shd w:fill="C0392B" w:color="auto" w:val="clear"/>
+            <w:tcMar>
+              <w:top w:type="dxa" w:w="70"/>
+              <w:left w:type="dxa" w:w="110"/>
+              <w:bottom w:type="dxa" w:w="70"/>
+              <w:right w:type="dxa" w:w="110"/>
+            </w:tcMar>
+            <w:vAlign w:val="center"/>
+          </w:tcPr>
+          <w:p>
+            <w:pPr>
+              <w:spacing w:after="0" w:line="252"/>
+              <w:jc w:val="center"/>
+            </w:pPr>
+            <w:r>
+              <w:rPr>
+                <w:b/>
+                <w:bCs/>
+                <w:color w:val="FFFFFF"/>
+                <w:sz w:val="20"/>
+                <w:szCs w:val="20"/>
+              </w:rPr>
+              <w:t xml:space="preserve">High</w:t>
+            </w:r>
+          </w:p>
+        </w:tc>
+      </w:tr>
+      <w:tr>
+        <w:tc>
+          <w:tcPr>
+            <w:tcW w:type="dxa" w:w="800"/>
             <w:tcMar>
               <w:top w:type="dxa" w:w="70"/>
               <w:left w:type="dxa" w:w="110"/>
@@ -13810,7 +14250,32 @@
         </w:tc>
         <w:tc>
           <w:tcPr>
-            <w:tcW w:type="dxa" w:w="2500"/>
+            <w:tcW w:type="dxa" w:w="1150"/>
+            <w:tcMar>
+              <w:top w:type="dxa" w:w="70"/>
+              <w:left w:type="dxa" w:w="110"/>
+              <w:bottom w:type="dxa" w:w="70"/>
+              <w:right w:type="dxa" w:w="110"/>
+            </w:tcMar>
+            <w:vAlign w:val="center"/>
+          </w:tcPr>
+          <w:p>
+            <w:pPr>
+              <w:spacing w:after="0" w:line="252"/>
+              <w:jc w:val="left"/>
+            </w:pPr>
+            <w:r>
+              <w:rPr>
+                <w:sz w:val="18"/>
+                <w:szCs w:val="18"/>
+              </w:rPr>
+              <w:t xml:space="preserve">CWE-16, 200, 693</w:t>
+            </w:r>
+          </w:p>
+        </w:tc>
+        <w:tc>
+          <w:tcPr>
+            <w:tcW w:type="dxa" w:w="2150"/>
             <w:tcMar>
               <w:top w:type="dxa" w:w="70"/>
               <w:left w:type="dxa" w:w="110"/>
@@ -13835,7 +14300,7 @@
         </w:tc>
         <w:tc>
           <w:tcPr>
-            <w:tcW w:type="dxa" w:w="4510"/>
+            <w:tcW w:type="dxa" w:w="4060"/>
             <w:tcMar>
               <w:top w:type="dxa" w:w="70"/>
               <w:left w:type="dxa" w:w="110"/>
@@ -13860,7 +14325,7 @@
         </w:tc>
         <w:tc>
           <w:tcPr>
-            <w:tcW w:type="dxa" w:w="1300"/>
+            <w:tcW w:type="dxa" w:w="1200"/>
             <w:shd w:fill="B9770E" w:color="auto" w:val="clear"/>
             <w:tcMar>
               <w:top w:type="dxa" w:w="70"/>
@@ -13911,7 +14376,7 @@
           <w:sz w:val="22"/>
           <w:szCs w:val="22"/>
         </w:rPr>
-        <w:t xml:space="preserve">The matrix below orders the confirmed findings for triage, with an indicative owner and target timeframe suitable for a development team remediating this application.</w:t>
+        <w:t xml:space="preserve">Because this is a business-critical banking application with live-equivalent exposure, all confirmed findings are scheduled for remediation within three days. The matrix below orders them for triage, with an indicative owner, effort and day-level target.</w:t>
       </w:r>
     </w:p>
     <w:tbl>
@@ -14264,7 +14729,7 @@
                 <w:sz w:val="20"/>
                 <w:szCs w:val="20"/>
               </w:rPr>
-              <w:t xml:space="preserve">~1 week</w:t>
+              <w:t xml:space="preserve">Within 3 days</w:t>
             </w:r>
           </w:p>
         </w:tc>
@@ -14406,7 +14871,6 @@
         <w:tc>
           <w:tcPr>
             <w:tcW w:type="dxa" w:w="1250"/>
-            <w:shd w:fill="F2F6FB" w:color="auto" w:val="clear"/>
             <w:tcMar>
               <w:top w:type="dxa" w:w="70"/>
               <w:left w:type="dxa" w:w="110"/>
@@ -14425,7 +14889,7 @@
                 <w:sz w:val="20"/>
                 <w:szCs w:val="20"/>
               </w:rPr>
-              <w:t xml:space="preserve">~1–2 weeks</w:t>
+              <w:t xml:space="preserve">Within 3 days</w:t>
             </w:r>
           </w:p>
         </w:tc>
@@ -14581,7 +15045,7 @@
                 <w:sz w:val="20"/>
                 <w:szCs w:val="20"/>
               </w:rPr>
-              <w:t xml:space="preserve">~1–2 weeks</w:t>
+              <w:t xml:space="preserve">Within 3 days</w:t>
             </w:r>
           </w:p>
         </w:tc>
@@ -14723,7 +15187,6 @@
         <w:tc>
           <w:tcPr>
             <w:tcW w:type="dxa" w:w="1250"/>
-            <w:shd w:fill="F2F6FB" w:color="auto" w:val="clear"/>
             <w:tcMar>
               <w:top w:type="dxa" w:w="70"/>
               <w:left w:type="dxa" w:w="110"/>
@@ -14742,7 +15205,7 @@
                 <w:sz w:val="20"/>
                 <w:szCs w:val="20"/>
               </w:rPr>
-              <w:t xml:space="preserve">~2 weeks</w:t>
+              <w:t xml:space="preserve">Within 3 days</w:t>
             </w:r>
           </w:p>
         </w:tc>
@@ -14898,7 +15361,7 @@
                 <w:sz w:val="20"/>
                 <w:szCs w:val="20"/>
               </w:rPr>
-              <w:t xml:space="preserve">~30 days</w:t>
+              <w:t xml:space="preserve">Within 3 days</w:t>
             </w:r>
           </w:p>
         </w:tc>
@@ -14914,7 +15377,7 @@
         <w:pStyle w:val="Heading3"/>
       </w:pPr>
       <w:r>
-        <w:t xml:space="preserve">Phased Remediation Strategy</w:t>
+        <w:t xml:space="preserve">Phased Remediation Strategy (3-day plan)</w:t>
       </w:r>
     </w:p>
     <w:p>
@@ -14933,7 +15396,7 @@
           <w:sz w:val="22"/>
           <w:szCs w:val="22"/>
         </w:rPr>
-        <w:t xml:space="preserve">Phase 1 — Immediate: </w:t>
+        <w:t xml:space="preserve">Day 1 — Immediate: </w:t>
       </w:r>
       <w:r>
         <w:rPr>
@@ -14959,14 +15422,14 @@
           <w:sz w:val="22"/>
           <w:szCs w:val="22"/>
         </w:rPr>
-        <w:t xml:space="preserve">Phase 2 — Short term: </w:t>
+        <w:t xml:space="preserve">Day 2 — Core fixes: </w:t>
       </w:r>
       <w:r>
         <w:rPr>
           <w:sz w:val="22"/>
           <w:szCs w:val="22"/>
         </w:rPr>
-        <w:t xml:space="preserve">output-encode support content with a CSP; enforce a strong password policy, remove default passwords, roll out MFA; add access-control tests to the pipeline.</w:t>
+        <w:t xml:space="preserve">output-encode support content with a CSP; enforce a strong password policy, remove default passwords, begin MFA roll-out; add access-control tests to the pipeline.</w:t>
       </w:r>
     </w:p>
     <w:p>
@@ -14985,14 +15448,14 @@
           <w:sz w:val="22"/>
           <w:szCs w:val="22"/>
         </w:rPr>
-        <w:t xml:space="preserve">Phase 3 — Longer term: </w:t>
+        <w:t xml:space="preserve">Day 3 — Hardening and retest: </w:t>
       </w:r>
       <w:r>
         <w:rPr>
           <w:sz w:val="22"/>
           <w:szCs w:val="22"/>
         </w:rPr>
-        <w:t xml:space="preserve">harden the server (headers, nginx update, HTTPS/TLS); standardise one server-side authorisation layer; retest all findings and reassess after major releases.</w:t>
+        <w:t xml:space="preserve">harden the server (headers, nginx update, HTTPS/TLS), standardise one server-side authorisation layer, and retest every finding to confirm closure.</w:t>
       </w:r>
     </w:p>
     <w:p>

</xml_diff>